<commit_message>
docs(report): remove SRM logo on page 5, renumber figures, and detail all implemented hardware/software features
</commit_message>
<xml_diff>
--- a/report/CrowdPulse_Project_Report.docx
+++ b/report/CrowdPulse_Project_Report.docx
@@ -90,7 +90,7 @@
     </w:p>
     <w:p>
       <w:pPr>
-        <w:spacing w:before="120" w:after="40"/>
+        <w:spacing w:before="160" w:after="40"/>
         <w:jc w:val="center"/>
       </w:pPr>
       <w:r>
@@ -106,7 +106,7 @@
     </w:p>
     <w:p>
       <w:pPr>
-        <w:spacing w:before="40" w:after="120" w:line="312" w:lineRule="auto"/>
+        <w:spacing w:before="40" w:after="280" w:line="312" w:lineRule="auto"/>
         <w:jc w:val="center"/>
       </w:pPr>
       <w:r>
@@ -117,30 +117,12 @@
           <w:color w:val="000000"/>
           <w:sz w:val="26"/>
         </w:rPr>
-        <w:t>21ECC301P / MICROPROCESSOR, MICROCONTROLLER, AND</w:t>
-        <w:br/>
-        <w:t>INTERFACING TECHNIQUES</w:t>
+        <w:t>21ECC301P / MICROPROCESSOR, MICROCONTROLLER, AND INTERFACING TECHNIQUES</w:t>
       </w:r>
     </w:p>
     <w:p>
       <w:pPr>
-        <w:spacing w:before="80" w:after="40"/>
-        <w:jc w:val="center"/>
-      </w:pPr>
-      <w:r>
-        <w:rPr>
-          <w:rFonts w:ascii="Times New Roman" w:hAnsi="Times New Roman"/>
-          <w:b w:val="0"/>
-          <w:i/>
-          <w:color w:val="000000"/>
-          <w:sz w:val="24"/>
-        </w:rPr>
-        <w:t>in</w:t>
-      </w:r>
-    </w:p>
-    <w:p>
-      <w:pPr>
-        <w:spacing w:before="40" w:after="80"/>
+        <w:spacing w:before="120" w:after="40"/>
         <w:jc w:val="center"/>
       </w:pPr>
       <w:r>
@@ -149,52 +131,24 @@
           <w:b/>
           <w:i w:val="0"/>
           <w:color w:val="000000"/>
-          <w:sz w:val="26"/>
+          <w:sz w:val="24"/>
         </w:rPr>
+        <w:t>BACHELOR OF TECHNOLOGY</w:t>
+        <w:br/>
+        <w:t>in</w:t>
+        <w:br/>
         <w:t>ELECTRONICS AND COMMUNICATION ENGINEERING</w:t>
       </w:r>
     </w:p>
     <w:p>
       <w:pPr>
-        <w:spacing w:before="40" w:after="40"/>
-        <w:jc w:val="center"/>
-      </w:pPr>
-      <w:r>
-        <w:rPr>
-          <w:rFonts w:ascii="Times New Roman" w:hAnsi="Times New Roman"/>
-          <w:b w:val="0"/>
-          <w:i/>
-          <w:color w:val="000000"/>
-          <w:sz w:val="24"/>
-        </w:rPr>
-        <w:t>of</w:t>
-      </w:r>
-    </w:p>
-    <w:p>
-      <w:pPr>
-        <w:spacing w:before="40" w:after="200"/>
-        <w:jc w:val="center"/>
-      </w:pPr>
-      <w:r>
-        <w:rPr>
-          <w:rFonts w:ascii="Times New Roman" w:hAnsi="Times New Roman"/>
-          <w:b/>
-          <w:i w:val="0"/>
-          <w:color w:val="000000"/>
-          <w:sz w:val="26"/>
-        </w:rPr>
-        <w:t>FACULTY OF ENGINEERING AND TECHNOLOGY</w:t>
-      </w:r>
-    </w:p>
-    <w:p>
-      <w:pPr>
-        <w:spacing w:before="80" w:after="200"/>
+        <w:spacing w:before="240" w:after="240"/>
         <w:jc w:val="center"/>
       </w:pPr>
       <w:r>
         <w:drawing>
           <wp:inline xmlns:a="http://schemas.openxmlformats.org/drawingml/2006/main" xmlns:pic="http://schemas.openxmlformats.org/drawingml/2006/picture">
-            <wp:extent cx="2743200" cy="1188720"/>
+            <wp:extent cx="2377440" cy="1030224"/>
             <wp:docPr id="1" name="Picture 1"/>
             <wp:cNvGraphicFramePr>
               <a:graphicFrameLocks noChangeAspect="1"/>
@@ -215,7 +169,7 @@
                   <pic:spPr>
                     <a:xfrm>
                       <a:off x="0" y="0"/>
-                      <a:ext cx="2743200" cy="1188720"/>
+                      <a:ext cx="2377440" cy="1030224"/>
                     </a:xfrm>
                     <a:prstGeom prst="rect"/>
                   </pic:spPr>
@@ -228,7 +182,7 @@
     </w:p>
     <w:p>
       <w:pPr>
-        <w:spacing w:before="80" w:after="0" w:line="312" w:lineRule="auto"/>
+        <w:spacing w:before="120" w:after="40" w:line="312" w:lineRule="auto"/>
         <w:jc w:val="center"/>
       </w:pPr>
       <w:r>
@@ -237,30 +191,15 @@
           <w:b/>
           <w:i w:val="0"/>
           <w:color w:val="000000"/>
-          <w:sz w:val="26"/>
+          <w:sz w:val="24"/>
         </w:rPr>
+        <w:t>FACULTY OF ENGINEERING AND TECHNOLOGY</w:t>
+        <w:br/>
         <w:t>SRM INSTITUTE OF SCIENCE AND TECHNOLOGY</w:t>
         <w:br/>
-      </w:r>
-      <w:r>
-        <w:rPr>
-          <w:rFonts w:ascii="Times New Roman" w:hAnsi="Times New Roman"/>
-          <w:b/>
-          <w:i w:val="0"/>
-          <w:color w:val="000000"/>
-          <w:sz w:val="26"/>
-        </w:rPr>
-        <w:t>RAMAPURAM</w:t>
+        <w:t>RAMAPURAM, CHENNAI – 600089</w:t>
         <w:br/>
-      </w:r>
-      <w:r>
-        <w:rPr>
-          <w:rFonts w:ascii="Times New Roman" w:hAnsi="Times New Roman"/>
-          <w:b/>
-          <w:i w:val="0"/>
-          <w:color w:val="000000"/>
-          <w:sz w:val="26"/>
-        </w:rPr>
+        <w:br/>
         <w:t>OCTOBER 2026</w:t>
       </w:r>
     </w:p>
@@ -288,7 +227,7 @@
     </w:p>
     <w:p>
       <w:pPr>
-        <w:spacing w:before="120" w:after="480" w:line="360" w:lineRule="auto"/>
+        <w:spacing w:before="200" w:after="600" w:line="360" w:lineRule="auto"/>
         <w:jc w:val="both"/>
       </w:pPr>
       <w:r>
@@ -299,7 +238,7 @@
           <w:color w:val="000000"/>
           <w:sz w:val="26"/>
         </w:rPr>
-        <w:t>Certified that this project report titled “CROWDPULSE: IOT-ENABLED MULTI-SENSOR HARDWARE TELEMETRY AND REAL-TIME AI CROWD DENSITY ESTIMATION SYSTEM” is the Bonafide work of “PARAMESHWARAN S [RA2411053020060], DHARSHAN KUMAR K [RA2411053020013]” who carried out the project work under my supervision as a batch. Certified further, that to the best of my knowledge the work reported herein does not form any other project report on the basis of which a degree or award was conferred on an earlier occasion for this or any other candidate.</w:t>
+        <w:t>Certified that this project report titled “CROWDPULSE: IOT-ENABLED MULTI-SENSOR HARDWARE TELEMETRY AND REAL-TIME AI CROWD DENSITY ESTIMATION SYSTEM” is the Bonafide work of “PARAMESHWARAN S [RA2411053020060], DHARSHAN KUMAR K [RA2411053020013]” who carried out the project work under my supervision.</w:t>
       </w:r>
     </w:p>
     <w:tbl>
@@ -315,11 +254,12 @@
       <w:tr>
         <w:tc>
           <w:tcPr>
-            <w:tcW w:type="dxa" w:w="4320"/>
+            <w:tcW w:type="dxa" w:w="4608"/>
           </w:tcPr>
           <w:p>
             <w:pPr>
               <w:spacing w:line="300" w:lineRule="auto"/>
+              <w:jc w:val="left"/>
             </w:pPr>
             <w:r>
               <w:rPr>
@@ -327,42 +267,32 @@
                 <w:b/>
                 <w:i w:val="0"/>
                 <w:color w:val="000000"/>
-                <w:sz w:val="26"/>
+                <w:sz w:val="24"/>
               </w:rPr>
-              <w:t>Signature</w:t>
+              <w:t>SIGNATURE</w:t>
               <w:br/>
               <w:br/>
               <w:br/>
-            </w:r>
-            <w:r>
-              <w:rPr>
-                <w:rFonts w:ascii="Times New Roman" w:hAnsi="Times New Roman"/>
-                <w:b w:val="0"/>
-                <w:i w:val="0"/>
-                <w:color w:val="000000"/>
-                <w:sz w:val="23"/>
-              </w:rPr>
-              <w:t>Dr. Reshma P Vengaloor</w:t>
               <w:br/>
-              <w:t>Assistant Professor,</w:t>
+              <w:br/>
+              <w:t>FACULTY GUIDE</w:t>
               <w:br/>
               <w:t>Department of ECE</w:t>
               <w:br/>
-              <w:t>SRM institute of Science &amp; Technology</w:t>
+              <w:t>SRM Institute of Science and Technology</w:t>
               <w:br/>
-              <w:t>Ramapuram Campus</w:t>
-              <w:br/>
-              <w:t>Chennai - 600089</w:t>
+              <w:t>Ramapuram, Chennai - 600089</w:t>
             </w:r>
           </w:p>
         </w:tc>
         <w:tc>
           <w:tcPr>
-            <w:tcW w:type="dxa" w:w="4320"/>
+            <w:tcW w:type="dxa" w:w="4608"/>
           </w:tcPr>
           <w:p>
             <w:pPr>
               <w:spacing w:line="300" w:lineRule="auto"/>
+              <w:jc w:val="right"/>
             </w:pPr>
             <w:r>
               <w:rPr>
@@ -370,32 +300,21 @@
                 <w:b/>
                 <w:i w:val="0"/>
                 <w:color w:val="000000"/>
-                <w:sz w:val="26"/>
+                <w:sz w:val="24"/>
               </w:rPr>
-              <w:t>Signature</w:t>
+              <w:t>SIGNATURE</w:t>
               <w:br/>
               <w:br/>
               <w:br/>
-            </w:r>
-            <w:r>
-              <w:rPr>
-                <w:rFonts w:ascii="Times New Roman" w:hAnsi="Times New Roman"/>
-                <w:b w:val="0"/>
-                <w:i w:val="0"/>
-                <w:color w:val="000000"/>
-                <w:sz w:val="23"/>
-              </w:rPr>
-              <w:t>Dr.S. Rajasekaran</w:t>
               <w:br/>
-              <w:t>Professor &amp; Head</w:t>
+              <w:br/>
+              <w:t>HEAD OF THE DEPARTMENT</w:t>
               <w:br/>
               <w:t>Department of ECE</w:t>
               <w:br/>
-              <w:t>SRM institute of Science &amp; Technology</w:t>
+              <w:t>SRM Institute of Science and Technology</w:t>
               <w:br/>
-              <w:t>Ramapuram Campus</w:t>
-              <w:br/>
-              <w:t>Chennai - 600089</w:t>
+              <w:t>Ramapuram, Chennai - 600089</w:t>
             </w:r>
           </w:p>
         </w:tc>
@@ -403,18 +322,19 @@
     </w:tbl>
     <w:p>
       <w:pPr>
-        <w:spacing w:before="480" w:after="480" w:line="360" w:lineRule="auto"/>
-        <w:jc w:val="both"/>
+        <w:spacing w:before="800" w:after="400"/>
+        <w:jc w:val="left"/>
       </w:pPr>
       <w:r>
         <w:rPr>
           <w:rFonts w:ascii="Times New Roman" w:hAnsi="Times New Roman"/>
           <w:b w:val="0"/>
-          <w:i w:val="0"/>
+          <w:i/>
           <w:color w:val="000000"/>
-          <w:sz w:val="26"/>
+          <w:sz w:val="24"/>
         </w:rPr>
-        <w:t>Submitted for University Examination held on ____________________ in the Department of Electronics and Communication Engineering, SRM Institute of Science and Technology, Ramapuram.</w:t>
+        <w:t>Submitted for the course practical examination held on: ____________________</w:t>
+        <w:br/>
       </w:r>
     </w:p>
     <w:tbl>
@@ -430,9 +350,13 @@
       <w:tr>
         <w:tc>
           <w:tcPr>
-            <w:tcW w:type="dxa" w:w="4320"/>
+            <w:tcW w:type="dxa" w:w="4608"/>
           </w:tcPr>
           <w:p>
+            <w:pPr>
+              <w:spacing w:line="288" w:lineRule="auto"/>
+              <w:jc w:val="left"/>
+            </w:pPr>
             <w:r>
               <w:rPr>
                 <w:rFonts w:ascii="Times New Roman" w:hAnsi="Times New Roman"/>
@@ -441,19 +365,19 @@
                 <w:color w:val="000000"/>
                 <w:sz w:val="24"/>
               </w:rPr>
+              <w:t>INTERNAL EXAMINER</w:t>
+              <w:br/>
               <w:t>Date:</w:t>
-              <w:br/>
-              <w:br/>
-              <w:t>Internal Examiner</w:t>
             </w:r>
           </w:p>
         </w:tc>
         <w:tc>
           <w:tcPr>
-            <w:tcW w:type="dxa" w:w="4320"/>
+            <w:tcW w:type="dxa" w:w="4608"/>
           </w:tcPr>
           <w:p>
             <w:pPr>
+              <w:spacing w:line="288" w:lineRule="auto"/>
               <w:jc w:val="right"/>
             </w:pPr>
             <w:r>
@@ -464,9 +388,9 @@
                 <w:color w:val="000000"/>
                 <w:sz w:val="24"/>
               </w:rPr>
+              <w:t>EXTERNAL EXAMINER</w:t>
               <w:br/>
-              <w:br/>
-              <w:t>External Examiner</w:t>
+              <w:t>Date:</w:t>
             </w:r>
           </w:p>
         </w:tc>
@@ -693,64 +617,7 @@
           <w:color w:val="000000"/>
           <w:sz w:val="26"/>
         </w:rPr>
-        <w:t>Pedestrian density management and catastrophic crush prevention represent paramount engineering challenges in contemporary public safety and civil infrastructure. Catastrophic stampedes and crowd collapse phenomena, frequently observed during major religious pilgrimages, sports competitions, musical festivals, and metropolitan transport interchanges, result from localized spatial bottlenecks coupled with rapid flow impedance. Under extreme physical compaction exceeding five to six persons per square meter, human crowds undergo a phase transition from fluid-like laminar movement to chaotic 'turbulent crowd shockwaves'. In this critical regime, physical contact forces propagate involuntarily across bodies, causing asphyxiation, blunt trauma, and loss of equilibrium. Traditional crowd control frameworks rely predominantly upon human surveillance personnel or passive closed-circuit television (CCTV) cameras. However, human operators suffer from cognitive fatigue and visual blind spots, while conventional CCTV systems offer only post-incident forensic video rather than actionable real-time hazard preemption.</w:t>
-      </w:r>
-    </w:p>
-    <w:p>
-      <w:pPr>
-        <w:keepNext/>
-        <w:spacing w:before="120" w:after="40"/>
-        <w:jc w:val="center"/>
-      </w:pPr>
-      <w:r>
-        <w:drawing>
-          <wp:inline xmlns:a="http://schemas.openxmlformats.org/drawingml/2006/main" xmlns:pic="http://schemas.openxmlformats.org/drawingml/2006/picture">
-            <wp:extent cx="2651760" cy="1149445"/>
-            <wp:docPr id="2" name="Picture 2"/>
-            <wp:cNvGraphicFramePr>
-              <a:graphicFrameLocks noChangeAspect="1"/>
-            </wp:cNvGraphicFramePr>
-            <a:graphic>
-              <a:graphicData uri="http://schemas.openxmlformats.org/drawingml/2006/picture">
-                <pic:pic>
-                  <pic:nvPicPr>
-                    <pic:cNvPr id="0" name="extracted_p5_0.jpeg"/>
-                    <pic:cNvPicPr/>
-                  </pic:nvPicPr>
-                  <pic:blipFill>
-                    <a:blip r:embed="rId12"/>
-                    <a:stretch>
-                      <a:fillRect/>
-                    </a:stretch>
-                  </pic:blipFill>
-                  <pic:spPr>
-                    <a:xfrm>
-                      <a:off x="0" y="0"/>
-                      <a:ext cx="2651760" cy="1149445"/>
-                    </a:xfrm>
-                    <a:prstGeom prst="rect"/>
-                  </pic:spPr>
-                </pic:pic>
-              </a:graphicData>
-            </a:graphic>
-          </wp:inline>
-        </w:drawing>
-      </w:r>
-    </w:p>
-    <w:p>
-      <w:pPr>
-        <w:spacing w:before="40" w:after="120"/>
-        <w:jc w:val="center"/>
-      </w:pPr>
-      <w:r>
-        <w:rPr>
-          <w:rFonts w:ascii="Times New Roman" w:hAnsi="Times New Roman"/>
-          <w:b/>
-          <w:i w:val="0"/>
-          <w:color w:val="000000"/>
-          <w:sz w:val="22"/>
-        </w:rPr>
-        <w:t>Figure 1. SRM Institute of Science and Technology Official Insignia</w:t>
+        <w:t>Pedestrian density management and catastrophic crush prevention represent paramount engineering challenges in contemporary public safety and civil infrastructure. Catastrophic stampedes and crowd collapses, observed during major pilgrimages, athletic events, and transit interchanges, result from spatial bottlenecks and flow impedance. Under extreme physical compaction exceeding five persons per square meter, human crowds undergo a phase transition from laminar movement to chaotic 'turbulent crowd shockwaves'. In this critical regime, physical contact forces propagate involuntarily across bodies, reaching compressive forces exceeding 4,500 N that cause compressive asphyxiation, blunt trauma, and loss of equilibrium. Traditional crowd control frameworks rely predominantly upon human surveillance personnel or passive CCTV cameras. However, human operators suffer from cognitive fatigue and visual blind spots, while conventional CCTV offers only post-incident forensic video rather than actionable real-time hazard preemption.</w:t>
       </w:r>
     </w:p>
     <w:p>
@@ -766,7 +633,7 @@
           <w:color w:val="000000"/>
           <w:sz w:val="26"/>
         </w:rPr>
-        <w:t>To mitigate these vulnerabilities, the laboratory curriculum of course 21ECC301P (Microprocessor, Microcontroller, and Interfacing Techniques) emphasizes the real-world application of embedded processor architectures, hardware timing synchronization, digital bus protocols, and sensory peripheral interfacing. The CrowdPulse project embodies these engineering paradigms by engineering a robust hardware telemetry unit coupled with real-time edge processing intelligence. By physically interfacing multi-modal transducers—incorporating digital temperature and relative humidity tracking (AM2302/DHT22), precision I2S digital acoustic pressure sensing (INMP441 MEMS microphone), and pyroelectric infrared peripheral movement detection (HC-SR501)—with modern dual-core embedded microcontrollers and foundational 8051 processor registers, CrowdPulse bridges the divide between physical hardware sensor acquisition and algorithmic early-warning crowd intelligence.</w:t>
+        <w:t>Optical surveillance approaches suffer from catastrophic degradation during crowd crushes: extreme visual occlusion masks lower-body motion, architectural bottlenecks obstruct camera vantages, and smoke or lighting shifts render computer vision blind. Furthermore, optical analytics fail to monitor physical microclimates and acoustic precursors occurring tens of seconds before visual stampede panic is visible. To mitigate these vulnerabilities, the laboratory curriculum of course 21ECC301P (Microprocessor, Microcontroller, and Interfacing Techniques) emphasizes embedded processor architectures, hardware timing, digital bus protocols, and sensory interfacing. The CrowdPulse project embodies these paradigms by interfacing multi-modal transducers—incorporating digital temperature/humidity tracking (AM2302), precision I2S digital acoustic sensing (INMP441 MEMS microphone) with a fast-attack envelope filter, 802.11 Wi-Fi promiscuous probe request sniffing, an SSD1306 OLED HUD, and pyroelectric motion detection (HC-SR501)—with dual-core microcontrollers and 8051 registers, bridging physical sensor acquisition and algorithmic early-warning intelligence.</w:t>
       </w:r>
     </w:p>
     <w:p>
@@ -1266,7 +1133,7 @@
           <w:color w:val="000000"/>
           <w:sz w:val="26"/>
         </w:rPr>
-        <w:t>The architectural structure of the CrowdPulse multi-sensor edge intelligence platform is partitioned into five distinct functional layers: the Sensor Transducer Layer, the Embedded Microcontroller Core, the Local Output Actuation Layer, the Edge Telemetry Gateway, and the Real-Time Analytics Server. Figure 2 illustrates the comprehensive interconnection and signal data flow across these subsystems.</w:t>
+        <w:t>The architectural structure of the CrowdPulse multi-sensor edge intelligence platform is partitioned into five distinct functional layers: the Sensor Transducer Layer, the Embedded Microcontroller Core, the Local Output Actuation Layer, the Edge Telemetry Gateway, and the Real-Time Analytics Server. Figure 1 illustrates the comprehensive interconnection and signal data flow across these subsystems.</w:t>
       </w:r>
     </w:p>
     <w:p>
@@ -1279,7 +1146,7 @@
         <w:drawing>
           <wp:inline xmlns:a="http://schemas.openxmlformats.org/drawingml/2006/main" xmlns:pic="http://schemas.openxmlformats.org/drawingml/2006/picture">
             <wp:extent cx="4754880" cy="2929775"/>
-            <wp:docPr id="3" name="Picture 3"/>
+            <wp:docPr id="2" name="Picture 2"/>
             <wp:cNvGraphicFramePr>
               <a:graphicFrameLocks noChangeAspect="1"/>
             </wp:cNvGraphicFramePr>
@@ -1291,7 +1158,7 @@
                     <pic:cNvPicPr/>
                   </pic:nvPicPr>
                   <pic:blipFill>
-                    <a:blip r:embed="rId13"/>
+                    <a:blip r:embed="rId12"/>
                     <a:stretch>
                       <a:fillRect/>
                     </a:stretch>
@@ -1323,7 +1190,7 @@
           <w:color w:val="000000"/>
           <w:sz w:val="22"/>
         </w:rPr>
-        <w:t>Figure 2. CrowdPulse Hardware Interfacing and System Block Diagram</w:t>
+        <w:t>Figure 1. CrowdPulse Hardware Interfacing and System Block Diagram</w:t>
       </w:r>
     </w:p>
     <w:p>
@@ -3299,7 +3166,7 @@
           <w:color w:val="000000"/>
           <w:sz w:val="26"/>
         </w:rPr>
-        <w:t>The circuit schematic for interfacing multi-modal sensors and local actuators with the microcontroller unit is illustrated in Figure 3. The circuit incorporates rigorous electrical conditioning stages to guarantee signal integrity, noise rejection, and transient suppression across all physical communication buses.</w:t>
+        <w:t>The circuit schematic for interfacing multi-modal sensors and local actuators with the microcontroller unit is illustrated in Figure 2. The circuit incorporates rigorous electrical conditioning stages to guarantee signal integrity, noise rejection, and transient suppression across all physical communication buses.</w:t>
       </w:r>
     </w:p>
     <w:p>
@@ -3312,7 +3179,7 @@
         <w:drawing>
           <wp:inline xmlns:a="http://schemas.openxmlformats.org/drawingml/2006/main" xmlns:pic="http://schemas.openxmlformats.org/drawingml/2006/picture">
             <wp:extent cx="4754880" cy="2929775"/>
-            <wp:docPr id="4" name="Picture 4"/>
+            <wp:docPr id="3" name="Picture 3"/>
             <wp:cNvGraphicFramePr>
               <a:graphicFrameLocks noChangeAspect="1"/>
             </wp:cNvGraphicFramePr>
@@ -3324,7 +3191,7 @@
                     <pic:cNvPicPr/>
                   </pic:nvPicPr>
                   <pic:blipFill>
-                    <a:blip r:embed="rId14"/>
+                    <a:blip r:embed="rId13"/>
                     <a:stretch>
                       <a:fillRect/>
                     </a:stretch>
@@ -3356,7 +3223,7 @@
           <w:color w:val="000000"/>
           <w:sz w:val="22"/>
         </w:rPr>
-        <w:t>Figure 3. Microcontroller Multi-Sensor Interfacing Circuit Schematic</w:t>
+        <w:t>Figure 2. Microcontroller Multi-Sensor Interfacing Circuit Schematic</w:t>
       </w:r>
     </w:p>
     <w:p>
@@ -3469,7 +3336,7 @@
           <w:color w:val="000000"/>
           <w:sz w:val="26"/>
         </w:rPr>
-        <w:t>The operational logic of the CrowdPulse edge telemetry unit executes a cyclic finite state machine (FSM) governed by hardware timer interrupts and deterministic sensor polling routines. Figure 4 illustrates the end-to-end procedural execution flowchart.</w:t>
+        <w:t>The operational logic of the CrowdPulse edge telemetry unit executes a cyclic finite state machine (FSM) governed by hardware timer interrupts and deterministic sensor polling routines. Figure 3 illustrates the end-to-end procedural execution flowchart.</w:t>
       </w:r>
     </w:p>
     <w:p>
@@ -3482,7 +3349,7 @@
         <w:drawing>
           <wp:inline xmlns:a="http://schemas.openxmlformats.org/drawingml/2006/main" xmlns:pic="http://schemas.openxmlformats.org/drawingml/2006/picture">
             <wp:extent cx="4754880" cy="2449484"/>
-            <wp:docPr id="5" name="Picture 5"/>
+            <wp:docPr id="4" name="Picture 4"/>
             <wp:cNvGraphicFramePr>
               <a:graphicFrameLocks noChangeAspect="1"/>
             </wp:cNvGraphicFramePr>
@@ -3494,7 +3361,7 @@
                     <pic:cNvPicPr/>
                   </pic:nvPicPr>
                   <pic:blipFill>
-                    <a:blip r:embed="rId15"/>
+                    <a:blip r:embed="rId14"/>
                     <a:stretch>
                       <a:fillRect/>
                     </a:stretch>
@@ -3526,7 +3393,7 @@
           <w:color w:val="000000"/>
           <w:sz w:val="22"/>
         </w:rPr>
-        <w:t>Figure 4. Firmware Execution and Multi-Sensor Risk Fusion Flowchart</w:t>
+        <w:t>Figure 3. Firmware Execution and Multi-Sensor Risk Fusion Flowchart</w:t>
       </w:r>
     </w:p>
     <w:p>
@@ -4276,7 +4143,7 @@
           <w:color w:val="000000"/>
           <w:sz w:val="26"/>
         </w:rPr>
-        <w:t>The operational principle of CrowdPulse integrates physical transduction, digital bus protocol decoding, statistical acoustic digital signal processing (DSP), and multi-criteria mathematical risk fusion. Figure 5 depicts the end-to-end data pipeline from physical sensor inputs to actuator decisions.</w:t>
+        <w:t>The operational principle of CrowdPulse integrates physical transduction, digital bus protocol decoding, statistical acoustic digital signal processing (DSP), and multi-criteria mathematical risk fusion. Figure 4 depicts the end-to-end data pipeline from physical sensor inputs to actuator decisions.</w:t>
       </w:r>
     </w:p>
     <w:p>
@@ -4289,7 +4156,7 @@
         <w:drawing>
           <wp:inline xmlns:a="http://schemas.openxmlformats.org/drawingml/2006/main" xmlns:pic="http://schemas.openxmlformats.org/drawingml/2006/picture">
             <wp:extent cx="4754880" cy="2884983"/>
-            <wp:docPr id="6" name="Picture 6"/>
+            <wp:docPr id="5" name="Picture 5"/>
             <wp:cNvGraphicFramePr>
               <a:graphicFrameLocks noChangeAspect="1"/>
             </wp:cNvGraphicFramePr>
@@ -4301,7 +4168,7 @@
                     <pic:cNvPicPr/>
                   </pic:nvPicPr>
                   <pic:blipFill>
-                    <a:blip r:embed="rId16"/>
+                    <a:blip r:embed="rId15"/>
                     <a:stretch>
                       <a:fillRect/>
                     </a:stretch>
@@ -4333,7 +4200,7 @@
           <w:color w:val="000000"/>
           <w:sz w:val="22"/>
         </w:rPr>
-        <w:t>Figure 5. Multi-Sensor Data Fusion Pipeline &amp; Stampede Risk Model</w:t>
+        <w:t>Figure 4. Multi-Sensor Data Fusion Pipeline &amp; Stampede Risk Model</w:t>
       </w:r>
     </w:p>
     <w:p>
@@ -4398,7 +4265,7 @@
           <w:color w:val="000000"/>
           <w:sz w:val="26"/>
         </w:rPr>
-        <w:t>3. HC-SR501 Pyroelectric Motion Detection: Human bodies naturally emit infrared electromagnetic radiation concentrated around a wavelength of 9.4 µm. The sensor incorporates a segmented Fresnel lens that focuses infrared radiation onto dual pyroelectric elements wired in electrical opposition. Movement across the optical fields creates a differential charge imbalance across the lithium tantalate crystalline element, triggering a bistable internal timer that outputs a clean 3.3V digital HIGH logic pulse.</w:t>
+        <w:t>3. HC-SR501 Pyroelectric Motion Detection &amp; 802.11 RF Sniffer: Human bodies naturally emit infrared electromagnetic radiation concentrated around a wavelength of 9.4 µm. The sensor incorporates a segmented Fresnel lens that focuses infrared radiation onto dual pyroelectric elements wired in electrical opposition. Movement creates a differential charge imbalance, triggering a 3.3V digital logic pulse. Concurrently, the 802.11 sniffer captures 2.4 GHz probe requests transmitted by pedestrian smartphones, filtering randomized MAC addresses to estimate crowd count independently of optical visibility.</w:t>
       </w:r>
     </w:p>
     <w:p>
@@ -4496,7 +4363,7 @@
           <w:color w:val="000000"/>
           <w:sz w:val="26"/>
         </w:rPr>
-        <w:t>The CrowdPulse multi-sensor edge telemetry system was subjected to rigorous empirical evaluation across simulated crowd surge scenarios, high-ambient noise interference tests, and sustained microclimate thermal variations. Figure 6 illustrates the real-time telemetry waveforms captured during active crowd monitoring trials.</w:t>
+        <w:t>The CrowdPulse multi-sensor edge telemetry system was subjected to rigorous empirical evaluation across simulated crowd surge scenarios, high-ambient noise interference tests, and sustained microclimate thermal variations. Figure 5 illustrates the real-time telemetry waveforms captured during active crowd monitoring trials.</w:t>
       </w:r>
     </w:p>
     <w:p>
@@ -4509,7 +4376,7 @@
         <w:drawing>
           <wp:inline xmlns:a="http://schemas.openxmlformats.org/drawingml/2006/main" xmlns:pic="http://schemas.openxmlformats.org/drawingml/2006/picture">
             <wp:extent cx="4754880" cy="3217949"/>
-            <wp:docPr id="7" name="Picture 7"/>
+            <wp:docPr id="6" name="Picture 6"/>
             <wp:cNvGraphicFramePr>
               <a:graphicFrameLocks noChangeAspect="1"/>
             </wp:cNvGraphicFramePr>
@@ -4521,7 +4388,7 @@
                     <pic:cNvPicPr/>
                   </pic:nvPicPr>
                   <pic:blipFill>
-                    <a:blip r:embed="rId17"/>
+                    <a:blip r:embed="rId16"/>
                     <a:stretch>
                       <a:fillRect/>
                     </a:stretch>
@@ -4553,7 +4420,7 @@
           <w:color w:val="000000"/>
           <w:sz w:val="22"/>
         </w:rPr>
-        <w:t>Figure 6. Real-Time Hardware Telemetry, Acoustic Decibels, and Stampede Risk Curves</w:t>
+        <w:t>Figure 5. Real-Time Hardware Telemetry, Acoustic Decibels, and Stampede Risk Curves</w:t>
       </w:r>
     </w:p>
     <w:p>
@@ -4586,7 +4453,7 @@
           <w:color w:val="000000"/>
           <w:sz w:val="26"/>
         </w:rPr>
-        <w:t>The telemetry plots in Figure 6 substantiate the multi-sensor synergy. In Figure 6(a), baseline ambient acoustic noise remains at 48 dB SPL during standard conditions. At t = 28s, simulated vocal panic and physical crush sounds initiate a rapid decibel surge, peaking at 88.4 dB SPL at t = 32s. Concurrently, Figure 6(b) plots the YOLOv8 person detection count surging from 14 to 48 individuals within a 15-meter corridor zone. Figure 6(c) displays the fused Stampede Risk Index, which crosses the warning advisory line (35%) at t = 22s and triggers the 70% critical siren alarm at t = 30s. Figure 6(d) confirms the thermal dissipation of concentrated bodies, where local temperature rises by 2.2°C and humidity shifts by 3.5% RH. This multi-sensor correlation provides emergency services an early-warning window of 38 seconds prior to simulated physical blockage.</w:t>
+        <w:t>The telemetry plots in Figure 5 substantiate the multi-sensor synergy. In Figure 5(a), baseline ambient acoustic noise remains at 48 dB SPL during standard conditions. At t = 28s, simulated vocal panic and physical crush sounds initiate a rapid decibel surge, peaking at 88.4 dB SPL at t = 32s. Concurrently, Figure 5(b) plots the YOLOv8 person detection count surging from 14 to 48 individuals within a 15-meter corridor zone. Figure 5(c) displays the fused Stampede Risk Index, which crosses the warning advisory line (35%) at t = 22s and triggers the 70% critical siren alarm at t = 30s. Figure 5(d) confirms the thermal dissipation of concentrated bodies, where local temperature rises by 2.2°C and humidity shifts by 3.5% RH. This multi-sensor correlation provides emergency services an early-warning window of 38 seconds prior to simulated physical blockage.</w:t>
       </w:r>
     </w:p>
     <w:p>
@@ -4619,7 +4486,7 @@
           <w:color w:val="000000"/>
           <w:sz w:val="26"/>
         </w:rPr>
-        <w:t>Figure 7 depicts the enterprise-grade surveillance dashboard deployed in the control room. The console integrates live camera streams with YOLOv8 bounding boxes, I2S sound pressure spectrum bars, microclimate gauges, and instantaneous hardware actuator statuses.</w:t>
+        <w:t>Figure 6 depicts the enterprise-grade surveillance dashboard deployed in the control room. The console integrates live camera streams with YOLOv8 bounding boxes, I2S sound pressure spectrum bars, microclimate gauges, and instantaneous hardware actuator statuses.</w:t>
       </w:r>
     </w:p>
     <w:p>
@@ -4632,7 +4499,7 @@
         <w:drawing>
           <wp:inline xmlns:a="http://schemas.openxmlformats.org/drawingml/2006/main" xmlns:pic="http://schemas.openxmlformats.org/drawingml/2006/picture">
             <wp:extent cx="4754880" cy="2737658"/>
-            <wp:docPr id="8" name="Picture 8"/>
+            <wp:docPr id="7" name="Picture 7"/>
             <wp:cNvGraphicFramePr>
               <a:graphicFrameLocks noChangeAspect="1"/>
             </wp:cNvGraphicFramePr>
@@ -4644,7 +4511,7 @@
                     <pic:cNvPicPr/>
                   </pic:nvPicPr>
                   <pic:blipFill>
-                    <a:blip r:embed="rId18"/>
+                    <a:blip r:embed="rId17"/>
                     <a:stretch>
                       <a:fillRect/>
                     </a:stretch>
@@ -4676,7 +4543,7 @@
           <w:color w:val="000000"/>
           <w:sz w:val="22"/>
         </w:rPr>
-        <w:t>Figure 7. CrowdPulse Real-Time Monitoring Dashboard Interface</w:t>
+        <w:t>Figure 6. CrowdPulse Real-Time Monitoring Dashboard Interface</w:t>
       </w:r>
     </w:p>
     <w:p>
@@ -5466,7 +5333,7 @@
           <w:color w:val="000000"/>
           <w:sz w:val="26"/>
         </w:rPr>
-        <w:t>In this project report, the design, hardware interfacing, assembly programming, and experimental validation of CrowdPulse—an autonomous multi-sensor edge telemetry and real-time stampede prediction platform—have been systematically demonstrated. By interfacing the AM2302 environmental sensor, INMP441 I2S MEMS microphone, and HC-SR501 PIR sensor with both modern dual-core embedded microcontrollers and classic 8051 microprocessor architectures, the project satisfies the technical requirements of course 21ECC301P (Microprocessor, Microcontroller, and Interfacing Techniques).</w:t>
+        <w:t>In this project report, the design, hardware interfacing, assembly programming, and experimental validation of CrowdPulse—an autonomous multi-sensor edge telemetry and real-time stampede prediction platform—have been systematically demonstrated. By interfacing the AM2302 environmental sensor, INMP441 I2S MEMS microphone, SSD1306 OLED display, 802.11 Wi-Fi promiscuous probe sniffer, and HC-SR501 PIR sensor with both modern dual-core embedded microcontrollers and classic 8051 microprocessor architectures, the project satisfies the technical requirements of course 21ECC301P (Microprocessor, Microcontroller, and Interfacing Techniques).</w:t>
       </w:r>
     </w:p>
     <w:p>

</xml_diff>

<commit_message>
docs: enforce 100% Times New Roman fonts and template format with no SRM logo on introduction
</commit_message>
<xml_diff>
--- a/report/CrowdPulse_Project_Report.docx
+++ b/report/CrowdPulse_Project_Report.docx
@@ -9,7 +9,7 @@
       </w:pPr>
       <w:r>
         <w:rPr>
-          <w:rFonts w:ascii="Times New Roman" w:hAnsi="Times New Roman"/>
+          <w:rFonts w:ascii="Times New Roman" w:hAnsi="Times New Roman" w:cs="Times New Roman" w:eastAsia="Times New Roman"/>
           <w:b/>
           <w:i w:val="0"/>
           <w:color w:val="000000"/>
@@ -20,7 +20,7 @@
       </w:r>
       <w:r>
         <w:rPr>
-          <w:rFonts w:ascii="Times New Roman" w:hAnsi="Times New Roman"/>
+          <w:rFonts w:ascii="Times New Roman" w:hAnsi="Times New Roman" w:cs="Times New Roman" w:eastAsia="Times New Roman"/>
           <w:b/>
           <w:i w:val="0"/>
           <w:color w:val="000000"/>
@@ -36,7 +36,7 @@
       </w:pPr>
       <w:r>
         <w:rPr>
-          <w:rFonts w:ascii="Times New Roman" w:hAnsi="Times New Roman"/>
+          <w:rFonts w:ascii="Times New Roman" w:hAnsi="Times New Roman" w:cs="Times New Roman" w:eastAsia="Times New Roman"/>
           <w:b/>
           <w:i w:val="0"/>
           <w:color w:val="000000"/>
@@ -52,7 +52,7 @@
       </w:pPr>
       <w:r>
         <w:rPr>
-          <w:rFonts w:ascii="Times New Roman" w:hAnsi="Times New Roman"/>
+          <w:rFonts w:ascii="Times New Roman" w:hAnsi="Times New Roman" w:cs="Times New Roman" w:eastAsia="Times New Roman"/>
           <w:b w:val="0"/>
           <w:i/>
           <w:color w:val="000000"/>
@@ -68,7 +68,7 @@
       </w:pPr>
       <w:r>
         <w:rPr>
-          <w:rFonts w:ascii="Times New Roman" w:hAnsi="Times New Roman"/>
+          <w:rFonts w:ascii="Times New Roman" w:hAnsi="Times New Roman" w:cs="Times New Roman" w:eastAsia="Times New Roman"/>
           <w:b/>
           <w:i w:val="0"/>
           <w:color w:val="000000"/>
@@ -79,7 +79,7 @@
       </w:r>
       <w:r>
         <w:rPr>
-          <w:rFonts w:ascii="Times New Roman" w:hAnsi="Times New Roman"/>
+          <w:rFonts w:ascii="Times New Roman" w:hAnsi="Times New Roman" w:cs="Times New Roman" w:eastAsia="Times New Roman"/>
           <w:b/>
           <w:i w:val="0"/>
           <w:color w:val="000000"/>
@@ -95,7 +95,7 @@
       </w:pPr>
       <w:r>
         <w:rPr>
-          <w:rFonts w:ascii="Times New Roman" w:hAnsi="Times New Roman"/>
+          <w:rFonts w:ascii="Times New Roman" w:hAnsi="Times New Roman" w:cs="Times New Roman" w:eastAsia="Times New Roman"/>
           <w:b w:val="0"/>
           <w:i/>
           <w:color w:val="000000"/>
@@ -111,7 +111,7 @@
       </w:pPr>
       <w:r>
         <w:rPr>
-          <w:rFonts w:ascii="Times New Roman" w:hAnsi="Times New Roman"/>
+          <w:rFonts w:ascii="Times New Roman" w:hAnsi="Times New Roman" w:cs="Times New Roman" w:eastAsia="Times New Roman"/>
           <w:b/>
           <w:i w:val="0"/>
           <w:color w:val="000000"/>
@@ -127,22 +127,66 @@
       </w:pPr>
       <w:r>
         <w:rPr>
-          <w:rFonts w:ascii="Times New Roman" w:hAnsi="Times New Roman"/>
+          <w:rFonts w:ascii="Times New Roman" w:hAnsi="Times New Roman" w:cs="Times New Roman" w:eastAsia="Times New Roman"/>
+          <w:b w:val="0"/>
+          <w:i/>
+          <w:color w:val="000000"/>
+          <w:sz w:val="24"/>
+        </w:rPr>
+        <w:t>in</w:t>
+      </w:r>
+    </w:p>
+    <w:p>
+      <w:pPr>
+        <w:spacing w:before="40" w:after="40"/>
+        <w:jc w:val="center"/>
+      </w:pPr>
+      <w:r>
+        <w:rPr>
+          <w:rFonts w:ascii="Times New Roman" w:hAnsi="Times New Roman" w:cs="Times New Roman" w:eastAsia="Times New Roman"/>
           <w:b/>
           <w:i w:val="0"/>
           <w:color w:val="000000"/>
-          <w:sz w:val="24"/>
+          <w:sz w:val="26"/>
         </w:rPr>
-        <w:t>BACHELOR OF TECHNOLOGY</w:t>
-        <w:br/>
-        <w:t>in</w:t>
-        <w:br/>
         <w:t>ELECTRONICS AND COMMUNICATION ENGINEERING</w:t>
       </w:r>
     </w:p>
     <w:p>
       <w:pPr>
-        <w:spacing w:before="240" w:after="240"/>
+        <w:spacing w:before="40" w:after="40"/>
+        <w:jc w:val="center"/>
+      </w:pPr>
+      <w:r>
+        <w:rPr>
+          <w:rFonts w:ascii="Times New Roman" w:hAnsi="Times New Roman" w:cs="Times New Roman" w:eastAsia="Times New Roman"/>
+          <w:b w:val="0"/>
+          <w:i/>
+          <w:color w:val="000000"/>
+          <w:sz w:val="24"/>
+        </w:rPr>
+        <w:t>of</w:t>
+      </w:r>
+    </w:p>
+    <w:p>
+      <w:pPr>
+        <w:spacing w:before="40" w:after="160"/>
+        <w:jc w:val="center"/>
+      </w:pPr>
+      <w:r>
+        <w:rPr>
+          <w:rFonts w:ascii="Times New Roman" w:hAnsi="Times New Roman" w:cs="Times New Roman" w:eastAsia="Times New Roman"/>
+          <w:b/>
+          <w:i w:val="0"/>
+          <w:color w:val="000000"/>
+          <w:sz w:val="26"/>
+        </w:rPr>
+        <w:t>FACULTY OF ENGINEERING AND TECHNOLOGY</w:t>
+      </w:r>
+    </w:p>
+    <w:p>
+      <w:pPr>
+        <w:spacing w:before="200" w:after="200"/>
         <w:jc w:val="center"/>
       </w:pPr>
       <w:r>
@@ -187,17 +231,15 @@
       </w:pPr>
       <w:r>
         <w:rPr>
-          <w:rFonts w:ascii="Times New Roman" w:hAnsi="Times New Roman"/>
+          <w:rFonts w:ascii="Times New Roman" w:hAnsi="Times New Roman" w:cs="Times New Roman" w:eastAsia="Times New Roman"/>
           <w:b/>
           <w:i w:val="0"/>
           <w:color w:val="000000"/>
-          <w:sz w:val="24"/>
+          <w:sz w:val="26"/>
         </w:rPr>
-        <w:t>FACULTY OF ENGINEERING AND TECHNOLOGY</w:t>
-        <w:br/>
         <w:t>SRM INSTITUTE OF SCIENCE AND TECHNOLOGY</w:t>
         <w:br/>
-        <w:t>RAMAPURAM, CHENNAI – 600089</w:t>
+        <w:t>RAMAPURAM</w:t>
         <w:br/>
         <w:br/>
         <w:t>OCTOBER 2026</w:t>
@@ -216,7 +258,7 @@
       </w:pPr>
       <w:r>
         <w:rPr>
-          <w:rFonts w:ascii="Times New Roman" w:hAnsi="Times New Roman"/>
+          <w:rFonts w:ascii="Times New Roman" w:hAnsi="Times New Roman" w:cs="Times New Roman" w:eastAsia="Times New Roman"/>
           <w:b/>
           <w:i w:val="0"/>
           <w:color w:val="000000"/>
@@ -227,114 +269,18 @@
     </w:p>
     <w:p>
       <w:pPr>
-        <w:spacing w:before="200" w:after="600" w:line="360" w:lineRule="auto"/>
+        <w:spacing w:before="200" w:after="520" w:line="360" w:lineRule="auto"/>
         <w:jc w:val="both"/>
       </w:pPr>
       <w:r>
         <w:rPr>
-          <w:rFonts w:ascii="Times New Roman" w:hAnsi="Times New Roman"/>
+          <w:rFonts w:ascii="Times New Roman" w:hAnsi="Times New Roman" w:cs="Times New Roman" w:eastAsia="Times New Roman"/>
           <w:b w:val="0"/>
           <w:i w:val="0"/>
           <w:color w:val="000000"/>
           <w:sz w:val="26"/>
         </w:rPr>
-        <w:t>Certified that this project report titled “CROWDPULSE: IOT-ENABLED MULTI-SENSOR HARDWARE TELEMETRY AND REAL-TIME AI CROWD DENSITY ESTIMATION SYSTEM” is the Bonafide work of “PARAMESHWARAN S [RA2411053020060], DHARSHAN KUMAR K [RA2411053020013]” who carried out the project work under my supervision.</w:t>
-      </w:r>
-    </w:p>
-    <w:tbl>
-      <w:tblPr>
-        <w:tblW w:type="auto" w:w="0"/>
-        <w:jc w:val="center"/>
-        <w:tblLook w:firstColumn="1" w:firstRow="1" w:lastColumn="0" w:lastRow="0" w:noHBand="0" w:noVBand="1" w:val="04A0"/>
-      </w:tblPr>
-      <w:tblGrid>
-        <w:gridCol w:w="4334"/>
-        <w:gridCol w:w="4334"/>
-      </w:tblGrid>
-      <w:tr>
-        <w:tc>
-          <w:tcPr>
-            <w:tcW w:type="dxa" w:w="4608"/>
-          </w:tcPr>
-          <w:p>
-            <w:pPr>
-              <w:spacing w:line="300" w:lineRule="auto"/>
-              <w:jc w:val="left"/>
-            </w:pPr>
-            <w:r>
-              <w:rPr>
-                <w:rFonts w:ascii="Times New Roman" w:hAnsi="Times New Roman"/>
-                <w:b/>
-                <w:i w:val="0"/>
-                <w:color w:val="000000"/>
-                <w:sz w:val="24"/>
-              </w:rPr>
-              <w:t>SIGNATURE</w:t>
-              <w:br/>
-              <w:br/>
-              <w:br/>
-              <w:br/>
-              <w:br/>
-              <w:t>FACULTY GUIDE</w:t>
-              <w:br/>
-              <w:t>Department of ECE</w:t>
-              <w:br/>
-              <w:t>SRM Institute of Science and Technology</w:t>
-              <w:br/>
-              <w:t>Ramapuram, Chennai - 600089</w:t>
-            </w:r>
-          </w:p>
-        </w:tc>
-        <w:tc>
-          <w:tcPr>
-            <w:tcW w:type="dxa" w:w="4608"/>
-          </w:tcPr>
-          <w:p>
-            <w:pPr>
-              <w:spacing w:line="300" w:lineRule="auto"/>
-              <w:jc w:val="right"/>
-            </w:pPr>
-            <w:r>
-              <w:rPr>
-                <w:rFonts w:ascii="Times New Roman" w:hAnsi="Times New Roman"/>
-                <w:b/>
-                <w:i w:val="0"/>
-                <w:color w:val="000000"/>
-                <w:sz w:val="24"/>
-              </w:rPr>
-              <w:t>SIGNATURE</w:t>
-              <w:br/>
-              <w:br/>
-              <w:br/>
-              <w:br/>
-              <w:br/>
-              <w:t>HEAD OF THE DEPARTMENT</w:t>
-              <w:br/>
-              <w:t>Department of ECE</w:t>
-              <w:br/>
-              <w:t>SRM Institute of Science and Technology</w:t>
-              <w:br/>
-              <w:t>Ramapuram, Chennai - 600089</w:t>
-            </w:r>
-          </w:p>
-        </w:tc>
-      </w:tr>
-    </w:tbl>
-    <w:p>
-      <w:pPr>
-        <w:spacing w:before="800" w:after="400"/>
-        <w:jc w:val="left"/>
-      </w:pPr>
-      <w:r>
-        <w:rPr>
-          <w:rFonts w:ascii="Times New Roman" w:hAnsi="Times New Roman"/>
-          <w:b w:val="0"/>
-          <w:i/>
-          <w:color w:val="000000"/>
-          <w:sz w:val="24"/>
-        </w:rPr>
-        <w:t>Submitted for the course practical examination held on: ____________________</w:t>
-        <w:br/>
+        <w:t>Certified that this project report titled “CROWDPULSE: IOT-ENABLED MULTI-SENSOR HARDWARE TELEMETRY AND REAL-TIME AI CROWD DENSITY ESTIMATION SYSTEM” is the Bonafide work of “PARAMESHWARAN S [RA2411053020060], DHARSHAN KUMAR K [RA2411053020013]” who carried out the project work under my supervision as a batch. Certified further, that to the best of my knowledge the work reported herein does not form any other project report on the basis of which a degree or award was conferred on an earlier occasion for this or any other candidate.</w:t>
       </w:r>
     </w:p>
     <w:tbl>
@@ -359,15 +305,29 @@
             </w:pPr>
             <w:r>
               <w:rPr>
-                <w:rFonts w:ascii="Times New Roman" w:hAnsi="Times New Roman"/>
-                <w:b/>
+                <w:rFonts w:ascii="Times New Roman" w:hAnsi="Times New Roman" w:cs="Times New Roman" w:eastAsia="Times New Roman"/>
+                <w:b w:val="0"/>
                 <w:i w:val="0"/>
                 <w:color w:val="000000"/>
                 <w:sz w:val="24"/>
               </w:rPr>
-              <w:t>INTERNAL EXAMINER</w:t>
+              <w:t>Signature</w:t>
               <w:br/>
-              <w:t>Date:</w:t>
+              <w:br/>
+              <w:br/>
+              <w:br/>
+              <w:br/>
+              <w:t>Dr. Reshma P Vengaloor</w:t>
+              <w:br/>
+              <w:t>Assistant Professor,</w:t>
+              <w:br/>
+              <w:t>Department of ECE</w:t>
+              <w:br/>
+              <w:t>SRM institute of Science &amp; Technology</w:t>
+              <w:br/>
+              <w:t>Ramapuram Campus</w:t>
+              <w:br/>
+              <w:t>Chennai - 600089</w:t>
             </w:r>
           </w:p>
         </w:tc>
@@ -378,19 +338,118 @@
           <w:p>
             <w:pPr>
               <w:spacing w:line="288" w:lineRule="auto"/>
-              <w:jc w:val="right"/>
+              <w:jc w:val="left"/>
             </w:pPr>
             <w:r>
               <w:rPr>
-                <w:rFonts w:ascii="Times New Roman" w:hAnsi="Times New Roman"/>
+                <w:rFonts w:ascii="Times New Roman" w:hAnsi="Times New Roman" w:cs="Times New Roman" w:eastAsia="Times New Roman"/>
+                <w:b w:val="0"/>
+                <w:i w:val="0"/>
+                <w:color w:val="000000"/>
+                <w:sz w:val="24"/>
+              </w:rPr>
+              <w:t>Signature</w:t>
+              <w:br/>
+              <w:br/>
+              <w:br/>
+              <w:br/>
+              <w:br/>
+              <w:t>Dr.S. Rajasekaran</w:t>
+              <w:br/>
+              <w:t>Professor &amp; Head</w:t>
+              <w:br/>
+              <w:t>Department of ECE</w:t>
+              <w:br/>
+              <w:t>SRM institute of Science &amp; Technology</w:t>
+              <w:br/>
+              <w:t>Ramapuram Campus</w:t>
+              <w:br/>
+              <w:t>Chennai - 600089</w:t>
+            </w:r>
+          </w:p>
+        </w:tc>
+      </w:tr>
+    </w:tbl>
+    <w:p>
+      <w:pPr>
+        <w:spacing w:before="560" w:after="240" w:line="300" w:lineRule="auto"/>
+        <w:jc w:val="both"/>
+      </w:pPr>
+      <w:r>
+        <w:rPr>
+          <w:rFonts w:ascii="Times New Roman" w:hAnsi="Times New Roman" w:cs="Times New Roman" w:eastAsia="Times New Roman"/>
+          <w:b w:val="0"/>
+          <w:i w:val="0"/>
+          <w:color w:val="000000"/>
+          <w:sz w:val="24"/>
+        </w:rPr>
+        <w:t>Submitted for University Examination held on ____________________ in the Department of Electronics and Communication Engineering, SRM Institute of Science and Technology, Ramapuram.</w:t>
+      </w:r>
+    </w:p>
+    <w:p>
+      <w:pPr>
+        <w:spacing w:before="160" w:after="480"/>
+        <w:jc w:val="left"/>
+      </w:pPr>
+      <w:r>
+        <w:rPr>
+          <w:rFonts w:ascii="Times New Roman" w:hAnsi="Times New Roman" w:cs="Times New Roman" w:eastAsia="Times New Roman"/>
+          <w:b w:val="0"/>
+          <w:i w:val="0"/>
+          <w:color w:val="000000"/>
+          <w:sz w:val="24"/>
+        </w:rPr>
+        <w:t>Date:</w:t>
+      </w:r>
+    </w:p>
+    <w:tbl>
+      <w:tblPr>
+        <w:tblW w:type="auto" w:w="0"/>
+        <w:jc w:val="center"/>
+        <w:tblLook w:firstColumn="1" w:firstRow="1" w:lastColumn="0" w:lastRow="0" w:noHBand="0" w:noVBand="1" w:val="04A0"/>
+      </w:tblPr>
+      <w:tblGrid>
+        <w:gridCol w:w="4334"/>
+        <w:gridCol w:w="4334"/>
+      </w:tblGrid>
+      <w:tr>
+        <w:tc>
+          <w:tcPr>
+            <w:tcW w:type="dxa" w:w="4608"/>
+          </w:tcPr>
+          <w:p>
+            <w:pPr>
+              <w:jc w:val="left"/>
+            </w:pPr>
+            <w:r>
+              <w:rPr>
+                <w:rFonts w:ascii="Times New Roman" w:hAnsi="Times New Roman" w:cs="Times New Roman" w:eastAsia="Times New Roman"/>
                 <w:b/>
                 <w:i w:val="0"/>
                 <w:color w:val="000000"/>
                 <w:sz w:val="24"/>
               </w:rPr>
-              <w:t>EXTERNAL EXAMINER</w:t>
-              <w:br/>
-              <w:t>Date:</w:t>
+              <w:t>Internal Examiner</w:t>
+            </w:r>
+          </w:p>
+        </w:tc>
+        <w:tc>
+          <w:tcPr>
+            <w:tcW w:type="dxa" w:w="4608"/>
+          </w:tcPr>
+          <w:p>
+            <w:pPr>
+              <w:jc w:val="right"/>
+            </w:pPr>
+            <w:r>
+              <w:rPr>
+                <w:rFonts w:ascii="Times New Roman" w:hAnsi="Times New Roman" w:cs="Times New Roman" w:eastAsia="Times New Roman"/>
+                <w:b/>
+                <w:i w:val="0"/>
+                <w:color w:val="000000"/>
+                <w:sz w:val="24"/>
+              </w:rPr>
+              <w:t>External Examiner</w:t>
             </w:r>
           </w:p>
         </w:tc>
@@ -409,7 +468,7 @@
       </w:pPr>
       <w:r>
         <w:rPr>
-          <w:rFonts w:ascii="Times New Roman" w:hAnsi="Times New Roman"/>
+          <w:rFonts w:ascii="Times New Roman" w:hAnsi="Times New Roman" w:cs="Times New Roman" w:eastAsia="Times New Roman"/>
           <w:b/>
           <w:i w:val="0"/>
           <w:color w:val="000000"/>
@@ -425,7 +484,7 @@
       </w:pPr>
       <w:r>
         <w:rPr>
-          <w:rFonts w:ascii="Times New Roman" w:hAnsi="Times New Roman"/>
+          <w:rFonts w:ascii="Times New Roman" w:hAnsi="Times New Roman" w:cs="Times New Roman" w:eastAsia="Times New Roman"/>
           <w:b w:val="0"/>
           <w:i w:val="0"/>
           <w:color w:val="000000"/>
@@ -441,7 +500,7 @@
       </w:pPr>
       <w:r>
         <w:rPr>
-          <w:rFonts w:ascii="Times New Roman" w:hAnsi="Times New Roman"/>
+          <w:rFonts w:ascii="Times New Roman" w:hAnsi="Times New Roman" w:cs="Times New Roman" w:eastAsia="Times New Roman"/>
           <w:b w:val="0"/>
           <w:i w:val="0"/>
           <w:color w:val="000000"/>
@@ -460,7 +519,7 @@
       </w:pPr>
       <w:r>
         <w:rPr>
-          <w:rFonts w:ascii="Times New Roman" w:hAnsi="Times New Roman"/>
+          <w:rFonts w:ascii="Times New Roman" w:hAnsi="Times New Roman" w:cs="Times New Roman" w:eastAsia="Times New Roman"/>
           <w:b/>
           <w:i w:val="0"/>
           <w:color w:val="000000"/>
@@ -493,7 +552,7 @@
       </w:pPr>
       <w:r>
         <w:rPr>
-          <w:rFonts w:ascii="Times New Roman" w:hAnsi="Times New Roman"/>
+          <w:rFonts w:ascii="Times New Roman" w:hAnsi="Times New Roman" w:cs="Times New Roman" w:eastAsia="Times New Roman"/>
           <w:b/>
           <w:i w:val="0"/>
           <w:color w:val="000000"/>
@@ -509,7 +568,7 @@
       </w:pPr>
       <w:r>
         <w:rPr>
-          <w:rFonts w:ascii="Times New Roman" w:hAnsi="Times New Roman"/>
+          <w:rFonts w:ascii="Times New Roman" w:hAnsi="Times New Roman" w:cs="Times New Roman" w:eastAsia="Times New Roman"/>
           <w:b w:val="0"/>
           <w:i w:val="0"/>
           <w:color w:val="000000"/>
@@ -525,7 +584,7 @@
       </w:pPr>
       <w:r>
         <w:rPr>
-          <w:rFonts w:ascii="Times New Roman" w:hAnsi="Times New Roman"/>
+          <w:rFonts w:ascii="Times New Roman" w:hAnsi="Times New Roman" w:cs="Times New Roman" w:eastAsia="Times New Roman"/>
           <w:b w:val="0"/>
           <w:i w:val="0"/>
           <w:color w:val="000000"/>
@@ -541,7 +600,7 @@
       </w:pPr>
       <w:r>
         <w:rPr>
-          <w:rFonts w:ascii="Times New Roman" w:hAnsi="Times New Roman"/>
+          <w:rFonts w:ascii="Times New Roman" w:hAnsi="Times New Roman" w:cs="Times New Roman" w:eastAsia="Times New Roman"/>
           <w:b w:val="0"/>
           <w:i w:val="0"/>
           <w:color w:val="000000"/>
@@ -557,7 +616,7 @@
       </w:pPr>
       <w:r>
         <w:rPr>
-          <w:rFonts w:ascii="Times New Roman" w:hAnsi="Times New Roman"/>
+          <w:rFonts w:ascii="Times New Roman" w:hAnsi="Times New Roman" w:cs="Times New Roman" w:eastAsia="Times New Roman"/>
           <w:b/>
           <w:i w:val="0"/>
           <w:color w:val="000000"/>
@@ -567,7 +626,7 @@
       </w:r>
       <w:r>
         <w:rPr>
-          <w:rFonts w:ascii="Times New Roman" w:hAnsi="Times New Roman"/>
+          <w:rFonts w:ascii="Times New Roman" w:hAnsi="Times New Roman" w:cs="Times New Roman" w:eastAsia="Times New Roman"/>
           <w:b w:val="0"/>
           <w:i/>
           <w:color w:val="000000"/>
@@ -595,7 +654,7 @@
       </w:pPr>
       <w:r>
         <w:rPr>
-          <w:rFonts w:ascii="Times New Roman" w:hAnsi="Times New Roman"/>
+          <w:rFonts w:ascii="Times New Roman" w:hAnsi="Times New Roman" w:cs="Times New Roman" w:eastAsia="Times New Roman"/>
           <w:b/>
           <w:i w:val="0"/>
           <w:color w:val="000000"/>
@@ -611,7 +670,7 @@
       </w:pPr>
       <w:r>
         <w:rPr>
-          <w:rFonts w:ascii="Times New Roman" w:hAnsi="Times New Roman"/>
+          <w:rFonts w:ascii="Times New Roman" w:hAnsi="Times New Roman" w:cs="Times New Roman" w:eastAsia="Times New Roman"/>
           <w:b w:val="0"/>
           <w:i w:val="0"/>
           <w:color w:val="000000"/>
@@ -627,7 +686,7 @@
       </w:pPr>
       <w:r>
         <w:rPr>
-          <w:rFonts w:ascii="Times New Roman" w:hAnsi="Times New Roman"/>
+          <w:rFonts w:ascii="Times New Roman" w:hAnsi="Times New Roman" w:cs="Times New Roman" w:eastAsia="Times New Roman"/>
           <w:b w:val="0"/>
           <w:i w:val="0"/>
           <w:color w:val="000000"/>
@@ -644,7 +703,7 @@
       </w:pPr>
       <w:r>
         <w:rPr>
-          <w:rFonts w:ascii="Times New Roman" w:hAnsi="Times New Roman"/>
+          <w:rFonts w:ascii="Times New Roman" w:hAnsi="Times New Roman" w:cs="Times New Roman" w:eastAsia="Times New Roman"/>
           <w:b/>
           <w:i w:val="0"/>
           <w:color w:val="000000"/>
@@ -660,7 +719,7 @@
       </w:pPr>
       <w:r>
         <w:rPr>
-          <w:rFonts w:ascii="Times New Roman" w:hAnsi="Times New Roman"/>
+          <w:rFonts w:ascii="Times New Roman" w:hAnsi="Times New Roman" w:cs="Times New Roman" w:eastAsia="Times New Roman"/>
           <w:b w:val="0"/>
           <w:i w:val="0"/>
           <w:color w:val="000000"/>
@@ -677,7 +736,7 @@
       </w:pPr>
       <w:r>
         <w:rPr>
-          <w:rFonts w:ascii="Times New Roman" w:hAnsi="Times New Roman"/>
+          <w:rFonts w:ascii="Times New Roman" w:hAnsi="Times New Roman" w:cs="Times New Roman" w:eastAsia="Times New Roman"/>
           <w:b/>
           <w:i w:val="0"/>
           <w:color w:val="000000"/>
@@ -693,7 +752,7 @@
       </w:pPr>
       <w:r>
         <w:rPr>
-          <w:rFonts w:ascii="Times New Roman" w:hAnsi="Times New Roman"/>
+          <w:rFonts w:ascii="Times New Roman" w:hAnsi="Times New Roman" w:cs="Times New Roman" w:eastAsia="Times New Roman"/>
           <w:b w:val="0"/>
           <w:i w:val="0"/>
           <w:color w:val="000000"/>
@@ -709,7 +768,7 @@
       </w:pPr>
       <w:r>
         <w:rPr>
-          <w:rFonts w:ascii="Times New Roman" w:hAnsi="Times New Roman"/>
+          <w:rFonts w:ascii="Times New Roman" w:hAnsi="Times New Roman" w:cs="Times New Roman" w:eastAsia="Times New Roman"/>
           <w:b w:val="0"/>
           <w:i w:val="0"/>
           <w:color w:val="000000"/>
@@ -725,7 +784,7 @@
       </w:pPr>
       <w:r>
         <w:rPr>
-          <w:rFonts w:ascii="Times New Roman" w:hAnsi="Times New Roman"/>
+          <w:rFonts w:ascii="Times New Roman" w:hAnsi="Times New Roman" w:cs="Times New Roman" w:eastAsia="Times New Roman"/>
           <w:b w:val="0"/>
           <w:i w:val="0"/>
           <w:color w:val="000000"/>
@@ -741,7 +800,7 @@
       </w:pPr>
       <w:r>
         <w:rPr>
-          <w:rFonts w:ascii="Times New Roman" w:hAnsi="Times New Roman"/>
+          <w:rFonts w:ascii="Times New Roman" w:hAnsi="Times New Roman" w:cs="Times New Roman" w:eastAsia="Times New Roman"/>
           <w:b w:val="0"/>
           <w:i w:val="0"/>
           <w:color w:val="000000"/>
@@ -757,7 +816,7 @@
       </w:pPr>
       <w:r>
         <w:rPr>
-          <w:rFonts w:ascii="Times New Roman" w:hAnsi="Times New Roman"/>
+          <w:rFonts w:ascii="Times New Roman" w:hAnsi="Times New Roman" w:cs="Times New Roman" w:eastAsia="Times New Roman"/>
           <w:b w:val="0"/>
           <w:i w:val="0"/>
           <w:color w:val="000000"/>
@@ -773,7 +832,7 @@
       </w:pPr>
       <w:r>
         <w:rPr>
-          <w:rFonts w:ascii="Times New Roman" w:hAnsi="Times New Roman"/>
+          <w:rFonts w:ascii="Times New Roman" w:hAnsi="Times New Roman" w:cs="Times New Roman" w:eastAsia="Times New Roman"/>
           <w:b w:val="0"/>
           <w:i w:val="0"/>
           <w:color w:val="000000"/>
@@ -790,7 +849,7 @@
       </w:pPr>
       <w:r>
         <w:rPr>
-          <w:rFonts w:ascii="Times New Roman" w:hAnsi="Times New Roman"/>
+          <w:rFonts w:ascii="Times New Roman" w:hAnsi="Times New Roman" w:cs="Times New Roman" w:eastAsia="Times New Roman"/>
           <w:b/>
           <w:i w:val="0"/>
           <w:color w:val="000000"/>
@@ -832,7 +891,7 @@
             </w:pPr>
             <w:r>
               <w:rPr>
-                <w:rFonts w:ascii="Times New Roman" w:hAnsi="Times New Roman"/>
+                <w:rFonts w:ascii="Times New Roman" w:hAnsi="Times New Roman" w:cs="Times New Roman" w:eastAsia="Times New Roman"/>
                 <w:b/>
                 <w:i w:val="0"/>
                 <w:color w:val="FFFFFF"/>
@@ -855,7 +914,7 @@
             </w:pPr>
             <w:r>
               <w:rPr>
-                <w:rFonts w:ascii="Times New Roman" w:hAnsi="Times New Roman"/>
+                <w:rFonts w:ascii="Times New Roman" w:hAnsi="Times New Roman" w:cs="Times New Roman" w:eastAsia="Times New Roman"/>
                 <w:b/>
                 <w:i w:val="0"/>
                 <w:color w:val="FFFFFF"/>
@@ -878,7 +937,7 @@
             </w:pPr>
             <w:r>
               <w:rPr>
-                <w:rFonts w:ascii="Times New Roman" w:hAnsi="Times New Roman"/>
+                <w:rFonts w:ascii="Times New Roman" w:hAnsi="Times New Roman" w:cs="Times New Roman" w:eastAsia="Times New Roman"/>
                 <w:b/>
                 <w:i w:val="0"/>
                 <w:color w:val="FFFFFF"/>
@@ -903,7 +962,7 @@
             </w:pPr>
             <w:r>
               <w:rPr>
-                <w:rFonts w:ascii="Times New Roman" w:hAnsi="Times New Roman"/>
+                <w:rFonts w:ascii="Times New Roman" w:hAnsi="Times New Roman" w:cs="Times New Roman" w:eastAsia="Times New Roman"/>
                 <w:b/>
                 <w:i w:val="0"/>
                 <w:color w:val="000000"/>
@@ -926,7 +985,7 @@
             </w:pPr>
             <w:r>
               <w:rPr>
-                <w:rFonts w:ascii="Times New Roman" w:hAnsi="Times New Roman"/>
+                <w:rFonts w:ascii="Times New Roman" w:hAnsi="Times New Roman" w:cs="Times New Roman" w:eastAsia="Times New Roman"/>
                 <w:b w:val="0"/>
                 <w:i w:val="0"/>
                 <w:color w:val="000000"/>
@@ -949,7 +1008,7 @@
             </w:pPr>
             <w:r>
               <w:rPr>
-                <w:rFonts w:ascii="Times New Roman" w:hAnsi="Times New Roman"/>
+                <w:rFonts w:ascii="Times New Roman" w:hAnsi="Times New Roman" w:cs="Times New Roman" w:eastAsia="Times New Roman"/>
                 <w:b w:val="0"/>
                 <w:i w:val="0"/>
                 <w:color w:val="000000"/>
@@ -974,7 +1033,7 @@
             </w:pPr>
             <w:r>
               <w:rPr>
-                <w:rFonts w:ascii="Times New Roman" w:hAnsi="Times New Roman"/>
+                <w:rFonts w:ascii="Times New Roman" w:hAnsi="Times New Roman" w:cs="Times New Roman" w:eastAsia="Times New Roman"/>
                 <w:b/>
                 <w:i w:val="0"/>
                 <w:color w:val="000000"/>
@@ -997,7 +1056,7 @@
             </w:pPr>
             <w:r>
               <w:rPr>
-                <w:rFonts w:ascii="Times New Roman" w:hAnsi="Times New Roman"/>
+                <w:rFonts w:ascii="Times New Roman" w:hAnsi="Times New Roman" w:cs="Times New Roman" w:eastAsia="Times New Roman"/>
                 <w:b w:val="0"/>
                 <w:i w:val="0"/>
                 <w:color w:val="000000"/>
@@ -1020,7 +1079,7 @@
             </w:pPr>
             <w:r>
               <w:rPr>
-                <w:rFonts w:ascii="Times New Roman" w:hAnsi="Times New Roman"/>
+                <w:rFonts w:ascii="Times New Roman" w:hAnsi="Times New Roman" w:cs="Times New Roman" w:eastAsia="Times New Roman"/>
                 <w:b w:val="0"/>
                 <w:i w:val="0"/>
                 <w:color w:val="000000"/>
@@ -1045,7 +1104,7 @@
             </w:pPr>
             <w:r>
               <w:rPr>
-                <w:rFonts w:ascii="Times New Roman" w:hAnsi="Times New Roman"/>
+                <w:rFonts w:ascii="Times New Roman" w:hAnsi="Times New Roman" w:cs="Times New Roman" w:eastAsia="Times New Roman"/>
                 <w:b/>
                 <w:i w:val="0"/>
                 <w:color w:val="000000"/>
@@ -1068,7 +1127,7 @@
             </w:pPr>
             <w:r>
               <w:rPr>
-                <w:rFonts w:ascii="Times New Roman" w:hAnsi="Times New Roman"/>
+                <w:rFonts w:ascii="Times New Roman" w:hAnsi="Times New Roman" w:cs="Times New Roman" w:eastAsia="Times New Roman"/>
                 <w:b w:val="0"/>
                 <w:i w:val="0"/>
                 <w:color w:val="000000"/>
@@ -1091,7 +1150,7 @@
             </w:pPr>
             <w:r>
               <w:rPr>
-                <w:rFonts w:ascii="Times New Roman" w:hAnsi="Times New Roman"/>
+                <w:rFonts w:ascii="Times New Roman" w:hAnsi="Times New Roman" w:cs="Times New Roman" w:eastAsia="Times New Roman"/>
                 <w:b w:val="0"/>
                 <w:i w:val="0"/>
                 <w:color w:val="000000"/>
@@ -1111,7 +1170,7 @@
       </w:pPr>
       <w:r>
         <w:rPr>
-          <w:rFonts w:ascii="Times New Roman" w:hAnsi="Times New Roman"/>
+          <w:rFonts w:ascii="Times New Roman" w:hAnsi="Times New Roman" w:cs="Times New Roman" w:eastAsia="Times New Roman"/>
           <w:b/>
           <w:i w:val="0"/>
           <w:color w:val="000000"/>
@@ -1127,7 +1186,7 @@
       </w:pPr>
       <w:r>
         <w:rPr>
-          <w:rFonts w:ascii="Times New Roman" w:hAnsi="Times New Roman"/>
+          <w:rFonts w:ascii="Times New Roman" w:hAnsi="Times New Roman" w:cs="Times New Roman" w:eastAsia="Times New Roman"/>
           <w:b w:val="0"/>
           <w:i w:val="0"/>
           <w:color w:val="000000"/>
@@ -1184,7 +1243,7 @@
       </w:pPr>
       <w:r>
         <w:rPr>
-          <w:rFonts w:ascii="Times New Roman" w:hAnsi="Times New Roman"/>
+          <w:rFonts w:ascii="Times New Roman" w:hAnsi="Times New Roman" w:cs="Times New Roman" w:eastAsia="Times New Roman"/>
           <w:b/>
           <w:i w:val="0"/>
           <w:color w:val="000000"/>
@@ -1200,7 +1259,7 @@
       </w:pPr>
       <w:r>
         <w:rPr>
-          <w:rFonts w:ascii="Times New Roman" w:hAnsi="Times New Roman"/>
+          <w:rFonts w:ascii="Times New Roman" w:hAnsi="Times New Roman" w:cs="Times New Roman" w:eastAsia="Times New Roman"/>
           <w:b w:val="0"/>
           <w:i w:val="0"/>
           <w:color w:val="000000"/>
@@ -1216,7 +1275,7 @@
       </w:pPr>
       <w:r>
         <w:rPr>
-          <w:rFonts w:ascii="Times New Roman" w:hAnsi="Times New Roman"/>
+          <w:rFonts w:ascii="Times New Roman" w:hAnsi="Times New Roman" w:cs="Times New Roman" w:eastAsia="Times New Roman"/>
           <w:b w:val="0"/>
           <w:i w:val="0"/>
           <w:color w:val="000000"/>
@@ -1233,7 +1292,7 @@
       </w:pPr>
       <w:r>
         <w:rPr>
-          <w:rFonts w:ascii="Times New Roman" w:hAnsi="Times New Roman"/>
+          <w:rFonts w:ascii="Times New Roman" w:hAnsi="Times New Roman" w:cs="Times New Roman" w:eastAsia="Times New Roman"/>
           <w:b/>
           <w:i w:val="0"/>
           <w:color w:val="000000"/>
@@ -1249,7 +1308,7 @@
       </w:pPr>
       <w:r>
         <w:rPr>
-          <w:rFonts w:ascii="Times New Roman" w:hAnsi="Times New Roman"/>
+          <w:rFonts w:ascii="Times New Roman" w:hAnsi="Times New Roman" w:cs="Times New Roman" w:eastAsia="Times New Roman"/>
           <w:b w:val="0"/>
           <w:i w:val="0"/>
           <w:color w:val="000000"/>
@@ -1266,7 +1325,7 @@
       </w:pPr>
       <w:r>
         <w:rPr>
-          <w:rFonts w:ascii="Times New Roman" w:hAnsi="Times New Roman"/>
+          <w:rFonts w:ascii="Times New Roman" w:hAnsi="Times New Roman" w:cs="Times New Roman" w:eastAsia="Times New Roman"/>
           <w:b/>
           <w:i w:val="0"/>
           <w:color w:val="000000"/>
@@ -1309,7 +1368,7 @@
             </w:pPr>
             <w:r>
               <w:rPr>
-                <w:rFonts w:ascii="Times New Roman" w:hAnsi="Times New Roman"/>
+                <w:rFonts w:ascii="Times New Roman" w:hAnsi="Times New Roman" w:cs="Times New Roman" w:eastAsia="Times New Roman"/>
                 <w:b/>
                 <w:i w:val="0"/>
                 <w:color w:val="FFFFFF"/>
@@ -1332,7 +1391,7 @@
             </w:pPr>
             <w:r>
               <w:rPr>
-                <w:rFonts w:ascii="Times New Roman" w:hAnsi="Times New Roman"/>
+                <w:rFonts w:ascii="Times New Roman" w:hAnsi="Times New Roman" w:cs="Times New Roman" w:eastAsia="Times New Roman"/>
                 <w:b/>
                 <w:i w:val="0"/>
                 <w:color w:val="FFFFFF"/>
@@ -1355,7 +1414,7 @@
             </w:pPr>
             <w:r>
               <w:rPr>
-                <w:rFonts w:ascii="Times New Roman" w:hAnsi="Times New Roman"/>
+                <w:rFonts w:ascii="Times New Roman" w:hAnsi="Times New Roman" w:cs="Times New Roman" w:eastAsia="Times New Roman"/>
                 <w:b/>
                 <w:i w:val="0"/>
                 <w:color w:val="FFFFFF"/>
@@ -1378,7 +1437,7 @@
             </w:pPr>
             <w:r>
               <w:rPr>
-                <w:rFonts w:ascii="Times New Roman" w:hAnsi="Times New Roman"/>
+                <w:rFonts w:ascii="Times New Roman" w:hAnsi="Times New Roman" w:cs="Times New Roman" w:eastAsia="Times New Roman"/>
                 <w:b/>
                 <w:i w:val="0"/>
                 <w:color w:val="FFFFFF"/>
@@ -1403,7 +1462,7 @@
             </w:pPr>
             <w:r>
               <w:rPr>
-                <w:rFonts w:ascii="Times New Roman" w:hAnsi="Times New Roman"/>
+                <w:rFonts w:ascii="Times New Roman" w:hAnsi="Times New Roman" w:cs="Times New Roman" w:eastAsia="Times New Roman"/>
                 <w:b/>
                 <w:i w:val="0"/>
                 <w:color w:val="000000"/>
@@ -1426,7 +1485,7 @@
             </w:pPr>
             <w:r>
               <w:rPr>
-                <w:rFonts w:ascii="Times New Roman" w:hAnsi="Times New Roman"/>
+                <w:rFonts w:ascii="Times New Roman" w:hAnsi="Times New Roman" w:cs="Times New Roman" w:eastAsia="Times New Roman"/>
                 <w:b w:val="0"/>
                 <w:i w:val="0"/>
                 <w:color w:val="000000"/>
@@ -1449,7 +1508,7 @@
             </w:pPr>
             <w:r>
               <w:rPr>
-                <w:rFonts w:ascii="Times New Roman" w:hAnsi="Times New Roman"/>
+                <w:rFonts w:ascii="Times New Roman" w:hAnsi="Times New Roman" w:cs="Times New Roman" w:eastAsia="Times New Roman"/>
                 <w:b w:val="0"/>
                 <w:i w:val="0"/>
                 <w:color w:val="000000"/>
@@ -1472,7 +1531,7 @@
             </w:pPr>
             <w:r>
               <w:rPr>
-                <w:rFonts w:ascii="Times New Roman" w:hAnsi="Times New Roman"/>
+                <w:rFonts w:ascii="Times New Roman" w:hAnsi="Times New Roman" w:cs="Times New Roman" w:eastAsia="Times New Roman"/>
                 <w:b w:val="0"/>
                 <w:i w:val="0"/>
                 <w:color w:val="000000"/>
@@ -1497,7 +1556,7 @@
             </w:pPr>
             <w:r>
               <w:rPr>
-                <w:rFonts w:ascii="Times New Roman" w:hAnsi="Times New Roman"/>
+                <w:rFonts w:ascii="Times New Roman" w:hAnsi="Times New Roman" w:cs="Times New Roman" w:eastAsia="Times New Roman"/>
                 <w:b/>
                 <w:i w:val="0"/>
                 <w:color w:val="000000"/>
@@ -1520,7 +1579,7 @@
             </w:pPr>
             <w:r>
               <w:rPr>
-                <w:rFonts w:ascii="Times New Roman" w:hAnsi="Times New Roman"/>
+                <w:rFonts w:ascii="Times New Roman" w:hAnsi="Times New Roman" w:cs="Times New Roman" w:eastAsia="Times New Roman"/>
                 <w:b w:val="0"/>
                 <w:i w:val="0"/>
                 <w:color w:val="000000"/>
@@ -1543,7 +1602,7 @@
             </w:pPr>
             <w:r>
               <w:rPr>
-                <w:rFonts w:ascii="Times New Roman" w:hAnsi="Times New Roman"/>
+                <w:rFonts w:ascii="Times New Roman" w:hAnsi="Times New Roman" w:cs="Times New Roman" w:eastAsia="Times New Roman"/>
                 <w:b w:val="0"/>
                 <w:i w:val="0"/>
                 <w:color w:val="000000"/>
@@ -1566,7 +1625,7 @@
             </w:pPr>
             <w:r>
               <w:rPr>
-                <w:rFonts w:ascii="Times New Roman" w:hAnsi="Times New Roman"/>
+                <w:rFonts w:ascii="Times New Roman" w:hAnsi="Times New Roman" w:cs="Times New Roman" w:eastAsia="Times New Roman"/>
                 <w:b w:val="0"/>
                 <w:i w:val="0"/>
                 <w:color w:val="000000"/>
@@ -1591,7 +1650,7 @@
             </w:pPr>
             <w:r>
               <w:rPr>
-                <w:rFonts w:ascii="Times New Roman" w:hAnsi="Times New Roman"/>
+                <w:rFonts w:ascii="Times New Roman" w:hAnsi="Times New Roman" w:cs="Times New Roman" w:eastAsia="Times New Roman"/>
                 <w:b/>
                 <w:i w:val="0"/>
                 <w:color w:val="000000"/>
@@ -1614,7 +1673,7 @@
             </w:pPr>
             <w:r>
               <w:rPr>
-                <w:rFonts w:ascii="Times New Roman" w:hAnsi="Times New Roman"/>
+                <w:rFonts w:ascii="Times New Roman" w:hAnsi="Times New Roman" w:cs="Times New Roman" w:eastAsia="Times New Roman"/>
                 <w:b w:val="0"/>
                 <w:i w:val="0"/>
                 <w:color w:val="000000"/>
@@ -1637,7 +1696,7 @@
             </w:pPr>
             <w:r>
               <w:rPr>
-                <w:rFonts w:ascii="Times New Roman" w:hAnsi="Times New Roman"/>
+                <w:rFonts w:ascii="Times New Roman" w:hAnsi="Times New Roman" w:cs="Times New Roman" w:eastAsia="Times New Roman"/>
                 <w:b w:val="0"/>
                 <w:i w:val="0"/>
                 <w:color w:val="000000"/>
@@ -1660,7 +1719,7 @@
             </w:pPr>
             <w:r>
               <w:rPr>
-                <w:rFonts w:ascii="Times New Roman" w:hAnsi="Times New Roman"/>
+                <w:rFonts w:ascii="Times New Roman" w:hAnsi="Times New Roman" w:cs="Times New Roman" w:eastAsia="Times New Roman"/>
                 <w:b w:val="0"/>
                 <w:i w:val="0"/>
                 <w:color w:val="000000"/>
@@ -1685,7 +1744,7 @@
             </w:pPr>
             <w:r>
               <w:rPr>
-                <w:rFonts w:ascii="Times New Roman" w:hAnsi="Times New Roman"/>
+                <w:rFonts w:ascii="Times New Roman" w:hAnsi="Times New Roman" w:cs="Times New Roman" w:eastAsia="Times New Roman"/>
                 <w:b/>
                 <w:i w:val="0"/>
                 <w:color w:val="000000"/>
@@ -1708,7 +1767,7 @@
             </w:pPr>
             <w:r>
               <w:rPr>
-                <w:rFonts w:ascii="Times New Roman" w:hAnsi="Times New Roman"/>
+                <w:rFonts w:ascii="Times New Roman" w:hAnsi="Times New Roman" w:cs="Times New Roman" w:eastAsia="Times New Roman"/>
                 <w:b w:val="0"/>
                 <w:i w:val="0"/>
                 <w:color w:val="000000"/>
@@ -1731,7 +1790,7 @@
             </w:pPr>
             <w:r>
               <w:rPr>
-                <w:rFonts w:ascii="Times New Roman" w:hAnsi="Times New Roman"/>
+                <w:rFonts w:ascii="Times New Roman" w:hAnsi="Times New Roman" w:cs="Times New Roman" w:eastAsia="Times New Roman"/>
                 <w:b w:val="0"/>
                 <w:i w:val="0"/>
                 <w:color w:val="000000"/>
@@ -1754,7 +1813,7 @@
             </w:pPr>
             <w:r>
               <w:rPr>
-                <w:rFonts w:ascii="Times New Roman" w:hAnsi="Times New Roman"/>
+                <w:rFonts w:ascii="Times New Roman" w:hAnsi="Times New Roman" w:cs="Times New Roman" w:eastAsia="Times New Roman"/>
                 <w:b w:val="0"/>
                 <w:i w:val="0"/>
                 <w:color w:val="000000"/>
@@ -1779,7 +1838,7 @@
             </w:pPr>
             <w:r>
               <w:rPr>
-                <w:rFonts w:ascii="Times New Roman" w:hAnsi="Times New Roman"/>
+                <w:rFonts w:ascii="Times New Roman" w:hAnsi="Times New Roman" w:cs="Times New Roman" w:eastAsia="Times New Roman"/>
                 <w:b/>
                 <w:i w:val="0"/>
                 <w:color w:val="000000"/>
@@ -1802,7 +1861,7 @@
             </w:pPr>
             <w:r>
               <w:rPr>
-                <w:rFonts w:ascii="Times New Roman" w:hAnsi="Times New Roman"/>
+                <w:rFonts w:ascii="Times New Roman" w:hAnsi="Times New Roman" w:cs="Times New Roman" w:eastAsia="Times New Roman"/>
                 <w:b w:val="0"/>
                 <w:i w:val="0"/>
                 <w:color w:val="000000"/>
@@ -1825,7 +1884,7 @@
             </w:pPr>
             <w:r>
               <w:rPr>
-                <w:rFonts w:ascii="Times New Roman" w:hAnsi="Times New Roman"/>
+                <w:rFonts w:ascii="Times New Roman" w:hAnsi="Times New Roman" w:cs="Times New Roman" w:eastAsia="Times New Roman"/>
                 <w:b w:val="0"/>
                 <w:i w:val="0"/>
                 <w:color w:val="000000"/>
@@ -1848,7 +1907,7 @@
             </w:pPr>
             <w:r>
               <w:rPr>
-                <w:rFonts w:ascii="Times New Roman" w:hAnsi="Times New Roman"/>
+                <w:rFonts w:ascii="Times New Roman" w:hAnsi="Times New Roman" w:cs="Times New Roman" w:eastAsia="Times New Roman"/>
                 <w:b w:val="0"/>
                 <w:i w:val="0"/>
                 <w:color w:val="000000"/>
@@ -1873,7 +1932,7 @@
             </w:pPr>
             <w:r>
               <w:rPr>
-                <w:rFonts w:ascii="Times New Roman" w:hAnsi="Times New Roman"/>
+                <w:rFonts w:ascii="Times New Roman" w:hAnsi="Times New Roman" w:cs="Times New Roman" w:eastAsia="Times New Roman"/>
                 <w:b/>
                 <w:i w:val="0"/>
                 <w:color w:val="000000"/>
@@ -1896,7 +1955,7 @@
             </w:pPr>
             <w:r>
               <w:rPr>
-                <w:rFonts w:ascii="Times New Roman" w:hAnsi="Times New Roman"/>
+                <w:rFonts w:ascii="Times New Roman" w:hAnsi="Times New Roman" w:cs="Times New Roman" w:eastAsia="Times New Roman"/>
                 <w:b w:val="0"/>
                 <w:i w:val="0"/>
                 <w:color w:val="000000"/>
@@ -1919,7 +1978,7 @@
             </w:pPr>
             <w:r>
               <w:rPr>
-                <w:rFonts w:ascii="Times New Roman" w:hAnsi="Times New Roman"/>
+                <w:rFonts w:ascii="Times New Roman" w:hAnsi="Times New Roman" w:cs="Times New Roman" w:eastAsia="Times New Roman"/>
                 <w:b w:val="0"/>
                 <w:i w:val="0"/>
                 <w:color w:val="000000"/>
@@ -1942,7 +2001,7 @@
             </w:pPr>
             <w:r>
               <w:rPr>
-                <w:rFonts w:ascii="Times New Roman" w:hAnsi="Times New Roman"/>
+                <w:rFonts w:ascii="Times New Roman" w:hAnsi="Times New Roman" w:cs="Times New Roman" w:eastAsia="Times New Roman"/>
                 <w:b w:val="0"/>
                 <w:i w:val="0"/>
                 <w:color w:val="000000"/>
@@ -1962,7 +2021,7 @@
       </w:pPr>
       <w:r>
         <w:rPr>
-          <w:rFonts w:ascii="Times New Roman" w:hAnsi="Times New Roman"/>
+          <w:rFonts w:ascii="Times New Roman" w:hAnsi="Times New Roman" w:cs="Times New Roman" w:eastAsia="Times New Roman"/>
           <w:b/>
           <w:i w:val="0"/>
           <w:color w:val="000000"/>
@@ -2005,7 +2064,7 @@
             </w:pPr>
             <w:r>
               <w:rPr>
-                <w:rFonts w:ascii="Times New Roman" w:hAnsi="Times New Roman"/>
+                <w:rFonts w:ascii="Times New Roman" w:hAnsi="Times New Roman" w:cs="Times New Roman" w:eastAsia="Times New Roman"/>
                 <w:b/>
                 <w:i w:val="0"/>
                 <w:color w:val="FFFFFF"/>
@@ -2028,7 +2087,7 @@
             </w:pPr>
             <w:r>
               <w:rPr>
-                <w:rFonts w:ascii="Times New Roman" w:hAnsi="Times New Roman"/>
+                <w:rFonts w:ascii="Times New Roman" w:hAnsi="Times New Roman" w:cs="Times New Roman" w:eastAsia="Times New Roman"/>
                 <w:b/>
                 <w:i w:val="0"/>
                 <w:color w:val="FFFFFF"/>
@@ -2051,7 +2110,7 @@
             </w:pPr>
             <w:r>
               <w:rPr>
-                <w:rFonts w:ascii="Times New Roman" w:hAnsi="Times New Roman"/>
+                <w:rFonts w:ascii="Times New Roman" w:hAnsi="Times New Roman" w:cs="Times New Roman" w:eastAsia="Times New Roman"/>
                 <w:b/>
                 <w:i w:val="0"/>
                 <w:color w:val="FFFFFF"/>
@@ -2074,7 +2133,7 @@
             </w:pPr>
             <w:r>
               <w:rPr>
-                <w:rFonts w:ascii="Times New Roman" w:hAnsi="Times New Roman"/>
+                <w:rFonts w:ascii="Times New Roman" w:hAnsi="Times New Roman" w:cs="Times New Roman" w:eastAsia="Times New Roman"/>
                 <w:b/>
                 <w:i w:val="0"/>
                 <w:color w:val="FFFFFF"/>
@@ -2099,7 +2158,7 @@
             </w:pPr>
             <w:r>
               <w:rPr>
-                <w:rFonts w:ascii="Times New Roman" w:hAnsi="Times New Roman"/>
+                <w:rFonts w:ascii="Times New Roman" w:hAnsi="Times New Roman" w:cs="Times New Roman" w:eastAsia="Times New Roman"/>
                 <w:b/>
                 <w:i w:val="0"/>
                 <w:color w:val="000000"/>
@@ -2122,7 +2181,7 @@
             </w:pPr>
             <w:r>
               <w:rPr>
-                <w:rFonts w:ascii="Times New Roman" w:hAnsi="Times New Roman"/>
+                <w:rFonts w:ascii="Times New Roman" w:hAnsi="Times New Roman" w:cs="Times New Roman" w:eastAsia="Times New Roman"/>
                 <w:b w:val="0"/>
                 <w:i w:val="0"/>
                 <w:color w:val="000000"/>
@@ -2145,7 +2204,7 @@
             </w:pPr>
             <w:r>
               <w:rPr>
-                <w:rFonts w:ascii="Times New Roman" w:hAnsi="Times New Roman"/>
+                <w:rFonts w:ascii="Times New Roman" w:hAnsi="Times New Roman" w:cs="Times New Roman" w:eastAsia="Times New Roman"/>
                 <w:b w:val="0"/>
                 <w:i w:val="0"/>
                 <w:color w:val="000000"/>
@@ -2168,7 +2227,7 @@
             </w:pPr>
             <w:r>
               <w:rPr>
-                <w:rFonts w:ascii="Times New Roman" w:hAnsi="Times New Roman"/>
+                <w:rFonts w:ascii="Times New Roman" w:hAnsi="Times New Roman" w:cs="Times New Roman" w:eastAsia="Times New Roman"/>
                 <w:b w:val="0"/>
                 <w:i w:val="0"/>
                 <w:color w:val="000000"/>
@@ -2193,7 +2252,7 @@
             </w:pPr>
             <w:r>
               <w:rPr>
-                <w:rFonts w:ascii="Times New Roman" w:hAnsi="Times New Roman"/>
+                <w:rFonts w:ascii="Times New Roman" w:hAnsi="Times New Roman" w:cs="Times New Roman" w:eastAsia="Times New Roman"/>
                 <w:b/>
                 <w:i w:val="0"/>
                 <w:color w:val="000000"/>
@@ -2216,7 +2275,7 @@
             </w:pPr>
             <w:r>
               <w:rPr>
-                <w:rFonts w:ascii="Times New Roman" w:hAnsi="Times New Roman"/>
+                <w:rFonts w:ascii="Times New Roman" w:hAnsi="Times New Roman" w:cs="Times New Roman" w:eastAsia="Times New Roman"/>
                 <w:b w:val="0"/>
                 <w:i w:val="0"/>
                 <w:color w:val="000000"/>
@@ -2239,7 +2298,7 @@
             </w:pPr>
             <w:r>
               <w:rPr>
-                <w:rFonts w:ascii="Times New Roman" w:hAnsi="Times New Roman"/>
+                <w:rFonts w:ascii="Times New Roman" w:hAnsi="Times New Roman" w:cs="Times New Roman" w:eastAsia="Times New Roman"/>
                 <w:b w:val="0"/>
                 <w:i w:val="0"/>
                 <w:color w:val="000000"/>
@@ -2262,7 +2321,7 @@
             </w:pPr>
             <w:r>
               <w:rPr>
-                <w:rFonts w:ascii="Times New Roman" w:hAnsi="Times New Roman"/>
+                <w:rFonts w:ascii="Times New Roman" w:hAnsi="Times New Roman" w:cs="Times New Roman" w:eastAsia="Times New Roman"/>
                 <w:b w:val="0"/>
                 <w:i w:val="0"/>
                 <w:color w:val="000000"/>
@@ -2287,7 +2346,7 @@
             </w:pPr>
             <w:r>
               <w:rPr>
-                <w:rFonts w:ascii="Times New Roman" w:hAnsi="Times New Roman"/>
+                <w:rFonts w:ascii="Times New Roman" w:hAnsi="Times New Roman" w:cs="Times New Roman" w:eastAsia="Times New Roman"/>
                 <w:b/>
                 <w:i w:val="0"/>
                 <w:color w:val="000000"/>
@@ -2310,7 +2369,7 @@
             </w:pPr>
             <w:r>
               <w:rPr>
-                <w:rFonts w:ascii="Times New Roman" w:hAnsi="Times New Roman"/>
+                <w:rFonts w:ascii="Times New Roman" w:hAnsi="Times New Roman" w:cs="Times New Roman" w:eastAsia="Times New Roman"/>
                 <w:b w:val="0"/>
                 <w:i w:val="0"/>
                 <w:color w:val="000000"/>
@@ -2333,7 +2392,7 @@
             </w:pPr>
             <w:r>
               <w:rPr>
-                <w:rFonts w:ascii="Times New Roman" w:hAnsi="Times New Roman"/>
+                <w:rFonts w:ascii="Times New Roman" w:hAnsi="Times New Roman" w:cs="Times New Roman" w:eastAsia="Times New Roman"/>
                 <w:b w:val="0"/>
                 <w:i w:val="0"/>
                 <w:color w:val="000000"/>
@@ -2356,7 +2415,7 @@
             </w:pPr>
             <w:r>
               <w:rPr>
-                <w:rFonts w:ascii="Times New Roman" w:hAnsi="Times New Roman"/>
+                <w:rFonts w:ascii="Times New Roman" w:hAnsi="Times New Roman" w:cs="Times New Roman" w:eastAsia="Times New Roman"/>
                 <w:b w:val="0"/>
                 <w:i w:val="0"/>
                 <w:color w:val="000000"/>
@@ -2381,7 +2440,7 @@
             </w:pPr>
             <w:r>
               <w:rPr>
-                <w:rFonts w:ascii="Times New Roman" w:hAnsi="Times New Roman"/>
+                <w:rFonts w:ascii="Times New Roman" w:hAnsi="Times New Roman" w:cs="Times New Roman" w:eastAsia="Times New Roman"/>
                 <w:b/>
                 <w:i w:val="0"/>
                 <w:color w:val="000000"/>
@@ -2404,7 +2463,7 @@
             </w:pPr>
             <w:r>
               <w:rPr>
-                <w:rFonts w:ascii="Times New Roman" w:hAnsi="Times New Roman"/>
+                <w:rFonts w:ascii="Times New Roman" w:hAnsi="Times New Roman" w:cs="Times New Roman" w:eastAsia="Times New Roman"/>
                 <w:b w:val="0"/>
                 <w:i w:val="0"/>
                 <w:color w:val="000000"/>
@@ -2427,7 +2486,7 @@
             </w:pPr>
             <w:r>
               <w:rPr>
-                <w:rFonts w:ascii="Times New Roman" w:hAnsi="Times New Roman"/>
+                <w:rFonts w:ascii="Times New Roman" w:hAnsi="Times New Roman" w:cs="Times New Roman" w:eastAsia="Times New Roman"/>
                 <w:b w:val="0"/>
                 <w:i w:val="0"/>
                 <w:color w:val="000000"/>
@@ -2450,7 +2509,7 @@
             </w:pPr>
             <w:r>
               <w:rPr>
-                <w:rFonts w:ascii="Times New Roman" w:hAnsi="Times New Roman"/>
+                <w:rFonts w:ascii="Times New Roman" w:hAnsi="Times New Roman" w:cs="Times New Roman" w:eastAsia="Times New Roman"/>
                 <w:b w:val="0"/>
                 <w:i w:val="0"/>
                 <w:color w:val="000000"/>
@@ -2475,7 +2534,7 @@
             </w:pPr>
             <w:r>
               <w:rPr>
-                <w:rFonts w:ascii="Times New Roman" w:hAnsi="Times New Roman"/>
+                <w:rFonts w:ascii="Times New Roman" w:hAnsi="Times New Roman" w:cs="Times New Roman" w:eastAsia="Times New Roman"/>
                 <w:b/>
                 <w:i w:val="0"/>
                 <w:color w:val="000000"/>
@@ -2498,7 +2557,7 @@
             </w:pPr>
             <w:r>
               <w:rPr>
-                <w:rFonts w:ascii="Times New Roman" w:hAnsi="Times New Roman"/>
+                <w:rFonts w:ascii="Times New Roman" w:hAnsi="Times New Roman" w:cs="Times New Roman" w:eastAsia="Times New Roman"/>
                 <w:b w:val="0"/>
                 <w:i w:val="0"/>
                 <w:color w:val="000000"/>
@@ -2521,7 +2580,7 @@
             </w:pPr>
             <w:r>
               <w:rPr>
-                <w:rFonts w:ascii="Times New Roman" w:hAnsi="Times New Roman"/>
+                <w:rFonts w:ascii="Times New Roman" w:hAnsi="Times New Roman" w:cs="Times New Roman" w:eastAsia="Times New Roman"/>
                 <w:b w:val="0"/>
                 <w:i w:val="0"/>
                 <w:color w:val="000000"/>
@@ -2544,7 +2603,7 @@
             </w:pPr>
             <w:r>
               <w:rPr>
-                <w:rFonts w:ascii="Times New Roman" w:hAnsi="Times New Roman"/>
+                <w:rFonts w:ascii="Times New Roman" w:hAnsi="Times New Roman" w:cs="Times New Roman" w:eastAsia="Times New Roman"/>
                 <w:b w:val="0"/>
                 <w:i w:val="0"/>
                 <w:color w:val="000000"/>
@@ -2569,7 +2628,7 @@
             </w:pPr>
             <w:r>
               <w:rPr>
-                <w:rFonts w:ascii="Times New Roman" w:hAnsi="Times New Roman"/>
+                <w:rFonts w:ascii="Times New Roman" w:hAnsi="Times New Roman" w:cs="Times New Roman" w:eastAsia="Times New Roman"/>
                 <w:b/>
                 <w:i w:val="0"/>
                 <w:color w:val="000000"/>
@@ -2592,7 +2651,7 @@
             </w:pPr>
             <w:r>
               <w:rPr>
-                <w:rFonts w:ascii="Times New Roman" w:hAnsi="Times New Roman"/>
+                <w:rFonts w:ascii="Times New Roman" w:hAnsi="Times New Roman" w:cs="Times New Roman" w:eastAsia="Times New Roman"/>
                 <w:b w:val="0"/>
                 <w:i w:val="0"/>
                 <w:color w:val="000000"/>
@@ -2615,7 +2674,7 @@
             </w:pPr>
             <w:r>
               <w:rPr>
-                <w:rFonts w:ascii="Times New Roman" w:hAnsi="Times New Roman"/>
+                <w:rFonts w:ascii="Times New Roman" w:hAnsi="Times New Roman" w:cs="Times New Roman" w:eastAsia="Times New Roman"/>
                 <w:b w:val="0"/>
                 <w:i w:val="0"/>
                 <w:color w:val="000000"/>
@@ -2638,7 +2697,7 @@
             </w:pPr>
             <w:r>
               <w:rPr>
-                <w:rFonts w:ascii="Times New Roman" w:hAnsi="Times New Roman"/>
+                <w:rFonts w:ascii="Times New Roman" w:hAnsi="Times New Roman" w:cs="Times New Roman" w:eastAsia="Times New Roman"/>
                 <w:b w:val="0"/>
                 <w:i w:val="0"/>
                 <w:color w:val="000000"/>
@@ -2663,7 +2722,7 @@
             </w:pPr>
             <w:r>
               <w:rPr>
-                <w:rFonts w:ascii="Times New Roman" w:hAnsi="Times New Roman"/>
+                <w:rFonts w:ascii="Times New Roman" w:hAnsi="Times New Roman" w:cs="Times New Roman" w:eastAsia="Times New Roman"/>
                 <w:b/>
                 <w:i w:val="0"/>
                 <w:color w:val="000000"/>
@@ -2686,7 +2745,7 @@
             </w:pPr>
             <w:r>
               <w:rPr>
-                <w:rFonts w:ascii="Times New Roman" w:hAnsi="Times New Roman"/>
+                <w:rFonts w:ascii="Times New Roman" w:hAnsi="Times New Roman" w:cs="Times New Roman" w:eastAsia="Times New Roman"/>
                 <w:b w:val="0"/>
                 <w:i w:val="0"/>
                 <w:color w:val="000000"/>
@@ -2709,7 +2768,7 @@
             </w:pPr>
             <w:r>
               <w:rPr>
-                <w:rFonts w:ascii="Times New Roman" w:hAnsi="Times New Roman"/>
+                <w:rFonts w:ascii="Times New Roman" w:hAnsi="Times New Roman" w:cs="Times New Roman" w:eastAsia="Times New Roman"/>
                 <w:b w:val="0"/>
                 <w:i w:val="0"/>
                 <w:color w:val="000000"/>
@@ -2732,7 +2791,7 @@
             </w:pPr>
             <w:r>
               <w:rPr>
-                <w:rFonts w:ascii="Times New Roman" w:hAnsi="Times New Roman"/>
+                <w:rFonts w:ascii="Times New Roman" w:hAnsi="Times New Roman" w:cs="Times New Roman" w:eastAsia="Times New Roman"/>
                 <w:b w:val="0"/>
                 <w:i w:val="0"/>
                 <w:color w:val="000000"/>
@@ -2752,7 +2811,7 @@
       </w:pPr>
       <w:r>
         <w:rPr>
-          <w:rFonts w:ascii="Times New Roman" w:hAnsi="Times New Roman"/>
+          <w:rFonts w:ascii="Times New Roman" w:hAnsi="Times New Roman" w:cs="Times New Roman" w:eastAsia="Times New Roman"/>
           <w:b/>
           <w:i w:val="0"/>
           <w:color w:val="000000"/>
@@ -2794,7 +2853,7 @@
             </w:pPr>
             <w:r>
               <w:rPr>
-                <w:rFonts w:ascii="Times New Roman" w:hAnsi="Times New Roman"/>
+                <w:rFonts w:ascii="Times New Roman" w:hAnsi="Times New Roman" w:cs="Times New Roman" w:eastAsia="Times New Roman"/>
                 <w:b/>
                 <w:i w:val="0"/>
                 <w:color w:val="FFFFFF"/>
@@ -2817,7 +2876,7 @@
             </w:pPr>
             <w:r>
               <w:rPr>
-                <w:rFonts w:ascii="Times New Roman" w:hAnsi="Times New Roman"/>
+                <w:rFonts w:ascii="Times New Roman" w:hAnsi="Times New Roman" w:cs="Times New Roman" w:eastAsia="Times New Roman"/>
                 <w:b/>
                 <w:i w:val="0"/>
                 <w:color w:val="FFFFFF"/>
@@ -2840,7 +2899,7 @@
             </w:pPr>
             <w:r>
               <w:rPr>
-                <w:rFonts w:ascii="Times New Roman" w:hAnsi="Times New Roman"/>
+                <w:rFonts w:ascii="Times New Roman" w:hAnsi="Times New Roman" w:cs="Times New Roman" w:eastAsia="Times New Roman"/>
                 <w:b/>
                 <w:i w:val="0"/>
                 <w:color w:val="FFFFFF"/>
@@ -2865,7 +2924,7 @@
             </w:pPr>
             <w:r>
               <w:rPr>
-                <w:rFonts w:ascii="Times New Roman" w:hAnsi="Times New Roman"/>
+                <w:rFonts w:ascii="Times New Roman" w:hAnsi="Times New Roman" w:cs="Times New Roman" w:eastAsia="Times New Roman"/>
                 <w:b/>
                 <w:i w:val="0"/>
                 <w:color w:val="000000"/>
@@ -2888,7 +2947,7 @@
             </w:pPr>
             <w:r>
               <w:rPr>
-                <w:rFonts w:ascii="Times New Roman" w:hAnsi="Times New Roman"/>
+                <w:rFonts w:ascii="Times New Roman" w:hAnsi="Times New Roman" w:cs="Times New Roman" w:eastAsia="Times New Roman"/>
                 <w:b w:val="0"/>
                 <w:i w:val="0"/>
                 <w:color w:val="000000"/>
@@ -2911,7 +2970,7 @@
             </w:pPr>
             <w:r>
               <w:rPr>
-                <w:rFonts w:ascii="Times New Roman" w:hAnsi="Times New Roman"/>
+                <w:rFonts w:ascii="Times New Roman" w:hAnsi="Times New Roman" w:cs="Times New Roman" w:eastAsia="Times New Roman"/>
                 <w:b w:val="0"/>
                 <w:i w:val="0"/>
                 <w:color w:val="000000"/>
@@ -2936,7 +2995,7 @@
             </w:pPr>
             <w:r>
               <w:rPr>
-                <w:rFonts w:ascii="Times New Roman" w:hAnsi="Times New Roman"/>
+                <w:rFonts w:ascii="Times New Roman" w:hAnsi="Times New Roman" w:cs="Times New Roman" w:eastAsia="Times New Roman"/>
                 <w:b/>
                 <w:i w:val="0"/>
                 <w:color w:val="000000"/>
@@ -2959,7 +3018,7 @@
             </w:pPr>
             <w:r>
               <w:rPr>
-                <w:rFonts w:ascii="Times New Roman" w:hAnsi="Times New Roman"/>
+                <w:rFonts w:ascii="Times New Roman" w:hAnsi="Times New Roman" w:cs="Times New Roman" w:eastAsia="Times New Roman"/>
                 <w:b w:val="0"/>
                 <w:i w:val="0"/>
                 <w:color w:val="000000"/>
@@ -2982,7 +3041,7 @@
             </w:pPr>
             <w:r>
               <w:rPr>
-                <w:rFonts w:ascii="Times New Roman" w:hAnsi="Times New Roman"/>
+                <w:rFonts w:ascii="Times New Roman" w:hAnsi="Times New Roman" w:cs="Times New Roman" w:eastAsia="Times New Roman"/>
                 <w:b w:val="0"/>
                 <w:i w:val="0"/>
                 <w:color w:val="000000"/>
@@ -3007,7 +3066,7 @@
             </w:pPr>
             <w:r>
               <w:rPr>
-                <w:rFonts w:ascii="Times New Roman" w:hAnsi="Times New Roman"/>
+                <w:rFonts w:ascii="Times New Roman" w:hAnsi="Times New Roman" w:cs="Times New Roman" w:eastAsia="Times New Roman"/>
                 <w:b/>
                 <w:i w:val="0"/>
                 <w:color w:val="000000"/>
@@ -3030,7 +3089,7 @@
             </w:pPr>
             <w:r>
               <w:rPr>
-                <w:rFonts w:ascii="Times New Roman" w:hAnsi="Times New Roman"/>
+                <w:rFonts w:ascii="Times New Roman" w:hAnsi="Times New Roman" w:cs="Times New Roman" w:eastAsia="Times New Roman"/>
                 <w:b w:val="0"/>
                 <w:i w:val="0"/>
                 <w:color w:val="000000"/>
@@ -3053,7 +3112,7 @@
             </w:pPr>
             <w:r>
               <w:rPr>
-                <w:rFonts w:ascii="Times New Roman" w:hAnsi="Times New Roman"/>
+                <w:rFonts w:ascii="Times New Roman" w:hAnsi="Times New Roman" w:cs="Times New Roman" w:eastAsia="Times New Roman"/>
                 <w:b w:val="0"/>
                 <w:i w:val="0"/>
                 <w:color w:val="000000"/>
@@ -3078,7 +3137,7 @@
             </w:pPr>
             <w:r>
               <w:rPr>
-                <w:rFonts w:ascii="Times New Roman" w:hAnsi="Times New Roman"/>
+                <w:rFonts w:ascii="Times New Roman" w:hAnsi="Times New Roman" w:cs="Times New Roman" w:eastAsia="Times New Roman"/>
                 <w:b/>
                 <w:i w:val="0"/>
                 <w:color w:val="000000"/>
@@ -3101,7 +3160,7 @@
             </w:pPr>
             <w:r>
               <w:rPr>
-                <w:rFonts w:ascii="Times New Roman" w:hAnsi="Times New Roman"/>
+                <w:rFonts w:ascii="Times New Roman" w:hAnsi="Times New Roman" w:cs="Times New Roman" w:eastAsia="Times New Roman"/>
                 <w:b w:val="0"/>
                 <w:i w:val="0"/>
                 <w:color w:val="000000"/>
@@ -3124,7 +3183,7 @@
             </w:pPr>
             <w:r>
               <w:rPr>
-                <w:rFonts w:ascii="Times New Roman" w:hAnsi="Times New Roman"/>
+                <w:rFonts w:ascii="Times New Roman" w:hAnsi="Times New Roman" w:cs="Times New Roman" w:eastAsia="Times New Roman"/>
                 <w:b w:val="0"/>
                 <w:i w:val="0"/>
                 <w:color w:val="000000"/>
@@ -3144,7 +3203,7 @@
       </w:pPr>
       <w:r>
         <w:rPr>
-          <w:rFonts w:ascii="Times New Roman" w:hAnsi="Times New Roman"/>
+          <w:rFonts w:ascii="Times New Roman" w:hAnsi="Times New Roman" w:cs="Times New Roman" w:eastAsia="Times New Roman"/>
           <w:b/>
           <w:i w:val="0"/>
           <w:color w:val="000000"/>
@@ -3160,7 +3219,7 @@
       </w:pPr>
       <w:r>
         <w:rPr>
-          <w:rFonts w:ascii="Times New Roman" w:hAnsi="Times New Roman"/>
+          <w:rFonts w:ascii="Times New Roman" w:hAnsi="Times New Roman" w:cs="Times New Roman" w:eastAsia="Times New Roman"/>
           <w:b w:val="0"/>
           <w:i w:val="0"/>
           <w:color w:val="000000"/>
@@ -3217,7 +3276,7 @@
       </w:pPr>
       <w:r>
         <w:rPr>
-          <w:rFonts w:ascii="Times New Roman" w:hAnsi="Times New Roman"/>
+          <w:rFonts w:ascii="Times New Roman" w:hAnsi="Times New Roman" w:cs="Times New Roman" w:eastAsia="Times New Roman"/>
           <w:b/>
           <w:i w:val="0"/>
           <w:color w:val="000000"/>
@@ -3233,7 +3292,7 @@
       </w:pPr>
       <w:r>
         <w:rPr>
-          <w:rFonts w:ascii="Times New Roman" w:hAnsi="Times New Roman"/>
+          <w:rFonts w:ascii="Times New Roman" w:hAnsi="Times New Roman" w:cs="Times New Roman" w:eastAsia="Times New Roman"/>
           <w:b w:val="0"/>
           <w:i w:val="0"/>
           <w:color w:val="000000"/>
@@ -3249,7 +3308,7 @@
       </w:pPr>
       <w:r>
         <w:rPr>
-          <w:rFonts w:ascii="Times New Roman" w:hAnsi="Times New Roman"/>
+          <w:rFonts w:ascii="Times New Roman" w:hAnsi="Times New Roman" w:cs="Times New Roman" w:eastAsia="Times New Roman"/>
           <w:b w:val="0"/>
           <w:i w:val="0"/>
           <w:color w:val="000000"/>
@@ -3265,7 +3324,7 @@
       </w:pPr>
       <w:r>
         <w:rPr>
-          <w:rFonts w:ascii="Times New Roman" w:hAnsi="Times New Roman"/>
+          <w:rFonts w:ascii="Times New Roman" w:hAnsi="Times New Roman" w:cs="Times New Roman" w:eastAsia="Times New Roman"/>
           <w:b w:val="0"/>
           <w:i w:val="0"/>
           <w:color w:val="000000"/>
@@ -3281,7 +3340,7 @@
       </w:pPr>
       <w:r>
         <w:rPr>
-          <w:rFonts w:ascii="Times New Roman" w:hAnsi="Times New Roman"/>
+          <w:rFonts w:ascii="Times New Roman" w:hAnsi="Times New Roman" w:cs="Times New Roman" w:eastAsia="Times New Roman"/>
           <w:b w:val="0"/>
           <w:i w:val="0"/>
           <w:color w:val="000000"/>
@@ -3297,7 +3356,7 @@
       </w:pPr>
       <w:r>
         <w:rPr>
-          <w:rFonts w:ascii="Times New Roman" w:hAnsi="Times New Roman"/>
+          <w:rFonts w:ascii="Times New Roman" w:hAnsi="Times New Roman" w:cs="Times New Roman" w:eastAsia="Times New Roman"/>
           <w:b w:val="0"/>
           <w:i w:val="0"/>
           <w:color w:val="000000"/>
@@ -3314,7 +3373,7 @@
       </w:pPr>
       <w:r>
         <w:rPr>
-          <w:rFonts w:ascii="Times New Roman" w:hAnsi="Times New Roman"/>
+          <w:rFonts w:ascii="Times New Roman" w:hAnsi="Times New Roman" w:cs="Times New Roman" w:eastAsia="Times New Roman"/>
           <w:b/>
           <w:i w:val="0"/>
           <w:color w:val="000000"/>
@@ -3330,7 +3389,7 @@
       </w:pPr>
       <w:r>
         <w:rPr>
-          <w:rFonts w:ascii="Times New Roman" w:hAnsi="Times New Roman"/>
+          <w:rFonts w:ascii="Times New Roman" w:hAnsi="Times New Roman" w:cs="Times New Roman" w:eastAsia="Times New Roman"/>
           <w:b w:val="0"/>
           <w:i w:val="0"/>
           <w:color w:val="000000"/>
@@ -3387,7 +3446,7 @@
       </w:pPr>
       <w:r>
         <w:rPr>
-          <w:rFonts w:ascii="Times New Roman" w:hAnsi="Times New Roman"/>
+          <w:rFonts w:ascii="Times New Roman" w:hAnsi="Times New Roman" w:cs="Times New Roman" w:eastAsia="Times New Roman"/>
           <w:b/>
           <w:i w:val="0"/>
           <w:color w:val="000000"/>
@@ -3404,7 +3463,7 @@
       </w:pPr>
       <w:r>
         <w:rPr>
-          <w:rFonts w:ascii="Times New Roman" w:hAnsi="Times New Roman"/>
+          <w:rFonts w:ascii="Times New Roman" w:hAnsi="Times New Roman" w:cs="Times New Roman" w:eastAsia="Times New Roman"/>
           <w:b/>
           <w:i w:val="0"/>
           <w:color w:val="000000"/>
@@ -3420,7 +3479,7 @@
       </w:pPr>
       <w:r>
         <w:rPr>
-          <w:rFonts w:ascii="Times New Roman" w:hAnsi="Times New Roman"/>
+          <w:rFonts w:ascii="Times New Roman" w:hAnsi="Times New Roman" w:cs="Times New Roman" w:eastAsia="Times New Roman"/>
           <w:b w:val="0"/>
           <w:i w:val="0"/>
           <w:color w:val="000000"/>
@@ -3436,7 +3495,7 @@
       </w:pPr>
       <w:r>
         <w:rPr>
-          <w:rFonts w:ascii="Times New Roman" w:hAnsi="Times New Roman"/>
+          <w:rFonts w:ascii="Times New Roman" w:hAnsi="Times New Roman" w:cs="Times New Roman" w:eastAsia="Times New Roman"/>
           <w:b w:val="0"/>
           <w:i w:val="0"/>
           <w:color w:val="000000"/>
@@ -3452,7 +3511,7 @@
       </w:pPr>
       <w:r>
         <w:rPr>
-          <w:rFonts w:ascii="Times New Roman" w:hAnsi="Times New Roman"/>
+          <w:rFonts w:ascii="Times New Roman" w:hAnsi="Times New Roman" w:cs="Times New Roman" w:eastAsia="Times New Roman"/>
           <w:b w:val="0"/>
           <w:i w:val="0"/>
           <w:color w:val="000000"/>
@@ -3468,7 +3527,7 @@
       </w:pPr>
       <w:r>
         <w:rPr>
-          <w:rFonts w:ascii="Times New Roman" w:hAnsi="Times New Roman"/>
+          <w:rFonts w:ascii="Times New Roman" w:hAnsi="Times New Roman" w:cs="Times New Roman" w:eastAsia="Times New Roman"/>
           <w:b w:val="0"/>
           <w:i w:val="0"/>
           <w:color w:val="000000"/>
@@ -3484,7 +3543,7 @@
       </w:pPr>
       <w:r>
         <w:rPr>
-          <w:rFonts w:ascii="Times New Roman" w:hAnsi="Times New Roman"/>
+          <w:rFonts w:ascii="Times New Roman" w:hAnsi="Times New Roman" w:cs="Times New Roman" w:eastAsia="Times New Roman"/>
           <w:b w:val="0"/>
           <w:i w:val="0"/>
           <w:color w:val="000000"/>
@@ -3500,7 +3559,7 @@
       </w:pPr>
       <w:r>
         <w:rPr>
-          <w:rFonts w:ascii="Times New Roman" w:hAnsi="Times New Roman"/>
+          <w:rFonts w:ascii="Times New Roman" w:hAnsi="Times New Roman" w:cs="Times New Roman" w:eastAsia="Times New Roman"/>
           <w:b w:val="0"/>
           <w:i w:val="0"/>
           <w:color w:val="000000"/>
@@ -3516,7 +3575,7 @@
       </w:pPr>
       <w:r>
         <w:rPr>
-          <w:rFonts w:ascii="Times New Roman" w:hAnsi="Times New Roman"/>
+          <w:rFonts w:ascii="Times New Roman" w:hAnsi="Times New Roman" w:cs="Times New Roman" w:eastAsia="Times New Roman"/>
           <w:b w:val="0"/>
           <w:i w:val="0"/>
           <w:color w:val="000000"/>
@@ -3533,7 +3592,7 @@
       </w:pPr>
       <w:r>
         <w:rPr>
-          <w:rFonts w:ascii="Times New Roman" w:hAnsi="Times New Roman"/>
+          <w:rFonts w:ascii="Times New Roman" w:hAnsi="Times New Roman" w:cs="Times New Roman" w:eastAsia="Times New Roman"/>
           <w:b/>
           <w:i w:val="0"/>
           <w:color w:val="000000"/>
@@ -3550,7 +3609,7 @@
       </w:pPr>
       <w:r>
         <w:rPr>
-          <w:rFonts w:ascii="Times New Roman" w:hAnsi="Times New Roman"/>
+          <w:rFonts w:ascii="Times New Roman" w:hAnsi="Times New Roman" w:cs="Times New Roman" w:eastAsia="Times New Roman"/>
           <w:b/>
           <w:i w:val="0"/>
           <w:color w:val="000000"/>
@@ -3566,7 +3625,7 @@
       </w:pPr>
       <w:r>
         <w:rPr>
-          <w:rFonts w:ascii="Times New Roman" w:hAnsi="Times New Roman"/>
+          <w:rFonts w:ascii="Times New Roman" w:hAnsi="Times New Roman" w:cs="Times New Roman" w:eastAsia="Times New Roman"/>
           <w:b w:val="0"/>
           <w:i w:val="0"/>
           <w:color w:val="000000"/>
@@ -3582,11 +3641,11 @@
       </w:pPr>
       <w:r>
         <w:rPr>
-          <w:rFonts w:ascii="Courier New" w:hAnsi="Courier New"/>
+          <w:rFonts w:ascii="Times New Roman" w:hAnsi="Times New Roman" w:cs="Times New Roman" w:eastAsia="Times New Roman"/>
           <w:b w:val="0"/>
           <w:i w:val="0"/>
           <w:color w:val="0F172A"/>
-          <w:sz w:val="17"/>
+          <w:sz w:val="18"/>
         </w:rPr>
         <w:t>import asyncio</w:t>
         <w:br/>
@@ -3787,7 +3846,7 @@
       </w:pPr>
       <w:r>
         <w:rPr>
-          <w:rFonts w:ascii="Times New Roman" w:hAnsi="Times New Roman"/>
+          <w:rFonts w:ascii="Times New Roman" w:hAnsi="Times New Roman" w:cs="Times New Roman" w:eastAsia="Times New Roman"/>
           <w:b/>
           <w:i w:val="0"/>
           <w:color w:val="000000"/>
@@ -3803,7 +3862,7 @@
       </w:pPr>
       <w:r>
         <w:rPr>
-          <w:rFonts w:ascii="Times New Roman" w:hAnsi="Times New Roman"/>
+          <w:rFonts w:ascii="Times New Roman" w:hAnsi="Times New Roman" w:cs="Times New Roman" w:eastAsia="Times New Roman"/>
           <w:b w:val="0"/>
           <w:i w:val="0"/>
           <w:color w:val="000000"/>
@@ -3819,11 +3878,11 @@
       </w:pPr>
       <w:r>
         <w:rPr>
-          <w:rFonts w:ascii="Courier New" w:hAnsi="Courier New"/>
+          <w:rFonts w:ascii="Times New Roman" w:hAnsi="Times New Roman" w:cs="Times New Roman" w:eastAsia="Times New Roman"/>
           <w:b w:val="0"/>
           <w:i w:val="0"/>
           <w:color w:val="0F172A"/>
-          <w:sz w:val="17"/>
+          <w:sz w:val="18"/>
         </w:rPr>
         <w:t>; ===================================================================</w:t>
         <w:br/>
@@ -4104,7 +4163,7 @@
       </w:pPr>
       <w:r>
         <w:rPr>
-          <w:rFonts w:ascii="Times New Roman" w:hAnsi="Times New Roman"/>
+          <w:rFonts w:ascii="Times New Roman" w:hAnsi="Times New Roman" w:cs="Times New Roman" w:eastAsia="Times New Roman"/>
           <w:b w:val="0"/>
           <w:i w:val="0"/>
           <w:color w:val="000000"/>
@@ -4121,7 +4180,7 @@
       </w:pPr>
       <w:r>
         <w:rPr>
-          <w:rFonts w:ascii="Times New Roman" w:hAnsi="Times New Roman"/>
+          <w:rFonts w:ascii="Times New Roman" w:hAnsi="Times New Roman" w:cs="Times New Roman" w:eastAsia="Times New Roman"/>
           <w:b/>
           <w:i w:val="0"/>
           <w:color w:val="000000"/>
@@ -4137,7 +4196,7 @@
       </w:pPr>
       <w:r>
         <w:rPr>
-          <w:rFonts w:ascii="Times New Roman" w:hAnsi="Times New Roman"/>
+          <w:rFonts w:ascii="Times New Roman" w:hAnsi="Times New Roman" w:cs="Times New Roman" w:eastAsia="Times New Roman"/>
           <w:b w:val="0"/>
           <w:i w:val="0"/>
           <w:color w:val="000000"/>
@@ -4194,7 +4253,7 @@
       </w:pPr>
       <w:r>
         <w:rPr>
-          <w:rFonts w:ascii="Times New Roman" w:hAnsi="Times New Roman"/>
+          <w:rFonts w:ascii="Times New Roman" w:hAnsi="Times New Roman" w:cs="Times New Roman" w:eastAsia="Times New Roman"/>
           <w:b/>
           <w:i w:val="0"/>
           <w:color w:val="000000"/>
@@ -4211,7 +4270,7 @@
       </w:pPr>
       <w:r>
         <w:rPr>
-          <w:rFonts w:ascii="Times New Roman" w:hAnsi="Times New Roman"/>
+          <w:rFonts w:ascii="Times New Roman" w:hAnsi="Times New Roman" w:cs="Times New Roman" w:eastAsia="Times New Roman"/>
           <w:b/>
           <w:i w:val="0"/>
           <w:color w:val="000000"/>
@@ -4227,7 +4286,7 @@
       </w:pPr>
       <w:r>
         <w:rPr>
-          <w:rFonts w:ascii="Times New Roman" w:hAnsi="Times New Roman"/>
+          <w:rFonts w:ascii="Times New Roman" w:hAnsi="Times New Roman" w:cs="Times New Roman" w:eastAsia="Times New Roman"/>
           <w:b w:val="0"/>
           <w:i w:val="0"/>
           <w:color w:val="000000"/>
@@ -4243,7 +4302,7 @@
       </w:pPr>
       <w:r>
         <w:rPr>
-          <w:rFonts w:ascii="Times New Roman" w:hAnsi="Times New Roman"/>
+          <w:rFonts w:ascii="Times New Roman" w:hAnsi="Times New Roman" w:cs="Times New Roman" w:eastAsia="Times New Roman"/>
           <w:b w:val="0"/>
           <w:i w:val="0"/>
           <w:color w:val="000000"/>
@@ -4259,7 +4318,7 @@
       </w:pPr>
       <w:r>
         <w:rPr>
-          <w:rFonts w:ascii="Times New Roman" w:hAnsi="Times New Roman"/>
+          <w:rFonts w:ascii="Times New Roman" w:hAnsi="Times New Roman" w:cs="Times New Roman" w:eastAsia="Times New Roman"/>
           <w:b w:val="0"/>
           <w:i w:val="0"/>
           <w:color w:val="000000"/>
@@ -4276,7 +4335,7 @@
       </w:pPr>
       <w:r>
         <w:rPr>
-          <w:rFonts w:ascii="Times New Roman" w:hAnsi="Times New Roman"/>
+          <w:rFonts w:ascii="Times New Roman" w:hAnsi="Times New Roman" w:cs="Times New Roman" w:eastAsia="Times New Roman"/>
           <w:b/>
           <w:i w:val="0"/>
           <w:color w:val="000000"/>
@@ -4292,7 +4351,7 @@
       </w:pPr>
       <w:r>
         <w:rPr>
-          <w:rFonts w:ascii="Times New Roman" w:hAnsi="Times New Roman"/>
+          <w:rFonts w:ascii="Times New Roman" w:hAnsi="Times New Roman" w:cs="Times New Roman" w:eastAsia="Times New Roman"/>
           <w:b w:val="0"/>
           <w:i w:val="0"/>
           <w:color w:val="000000"/>
@@ -4308,7 +4367,7 @@
       </w:pPr>
       <w:r>
         <w:rPr>
-          <w:rFonts w:ascii="Times New Roman" w:hAnsi="Times New Roman"/>
+          <w:rFonts w:ascii="Times New Roman" w:hAnsi="Times New Roman" w:cs="Times New Roman" w:eastAsia="Times New Roman"/>
           <w:b w:val="0"/>
           <w:i w:val="0"/>
           <w:color w:val="000000"/>
@@ -4324,7 +4383,7 @@
       </w:pPr>
       <w:r>
         <w:rPr>
-          <w:rFonts w:ascii="Times New Roman" w:hAnsi="Times New Roman"/>
+          <w:rFonts w:ascii="Times New Roman" w:hAnsi="Times New Roman" w:cs="Times New Roman" w:eastAsia="Times New Roman"/>
           <w:b w:val="0"/>
           <w:i w:val="0"/>
           <w:color w:val="000000"/>
@@ -4341,7 +4400,7 @@
       </w:pPr>
       <w:r>
         <w:rPr>
-          <w:rFonts w:ascii="Times New Roman" w:hAnsi="Times New Roman"/>
+          <w:rFonts w:ascii="Times New Roman" w:hAnsi="Times New Roman" w:cs="Times New Roman" w:eastAsia="Times New Roman"/>
           <w:b/>
           <w:i w:val="0"/>
           <w:color w:val="000000"/>
@@ -4357,7 +4416,7 @@
       </w:pPr>
       <w:r>
         <w:rPr>
-          <w:rFonts w:ascii="Times New Roman" w:hAnsi="Times New Roman"/>
+          <w:rFonts w:ascii="Times New Roman" w:hAnsi="Times New Roman" w:cs="Times New Roman" w:eastAsia="Times New Roman"/>
           <w:b w:val="0"/>
           <w:i w:val="0"/>
           <w:color w:val="000000"/>
@@ -4414,7 +4473,7 @@
       </w:pPr>
       <w:r>
         <w:rPr>
-          <w:rFonts w:ascii="Times New Roman" w:hAnsi="Times New Roman"/>
+          <w:rFonts w:ascii="Times New Roman" w:hAnsi="Times New Roman" w:cs="Times New Roman" w:eastAsia="Times New Roman"/>
           <w:b/>
           <w:i w:val="0"/>
           <w:color w:val="000000"/>
@@ -4431,7 +4490,7 @@
       </w:pPr>
       <w:r>
         <w:rPr>
-          <w:rFonts w:ascii="Times New Roman" w:hAnsi="Times New Roman"/>
+          <w:rFonts w:ascii="Times New Roman" w:hAnsi="Times New Roman" w:cs="Times New Roman" w:eastAsia="Times New Roman"/>
           <w:b/>
           <w:i w:val="0"/>
           <w:color w:val="000000"/>
@@ -4447,7 +4506,7 @@
       </w:pPr>
       <w:r>
         <w:rPr>
-          <w:rFonts w:ascii="Times New Roman" w:hAnsi="Times New Roman"/>
+          <w:rFonts w:ascii="Times New Roman" w:hAnsi="Times New Roman" w:cs="Times New Roman" w:eastAsia="Times New Roman"/>
           <w:b w:val="0"/>
           <w:i w:val="0"/>
           <w:color w:val="000000"/>
@@ -4464,7 +4523,7 @@
       </w:pPr>
       <w:r>
         <w:rPr>
-          <w:rFonts w:ascii="Times New Roman" w:hAnsi="Times New Roman"/>
+          <w:rFonts w:ascii="Times New Roman" w:hAnsi="Times New Roman" w:cs="Times New Roman" w:eastAsia="Times New Roman"/>
           <w:b/>
           <w:i w:val="0"/>
           <w:color w:val="000000"/>
@@ -4480,7 +4539,7 @@
       </w:pPr>
       <w:r>
         <w:rPr>
-          <w:rFonts w:ascii="Times New Roman" w:hAnsi="Times New Roman"/>
+          <w:rFonts w:ascii="Times New Roman" w:hAnsi="Times New Roman" w:cs="Times New Roman" w:eastAsia="Times New Roman"/>
           <w:b w:val="0"/>
           <w:i w:val="0"/>
           <w:color w:val="000000"/>
@@ -4537,7 +4596,7 @@
       </w:pPr>
       <w:r>
         <w:rPr>
-          <w:rFonts w:ascii="Times New Roman" w:hAnsi="Times New Roman"/>
+          <w:rFonts w:ascii="Times New Roman" w:hAnsi="Times New Roman" w:cs="Times New Roman" w:eastAsia="Times New Roman"/>
           <w:b/>
           <w:i w:val="0"/>
           <w:color w:val="000000"/>
@@ -4554,7 +4613,7 @@
       </w:pPr>
       <w:r>
         <w:rPr>
-          <w:rFonts w:ascii="Times New Roman" w:hAnsi="Times New Roman"/>
+          <w:rFonts w:ascii="Times New Roman" w:hAnsi="Times New Roman" w:cs="Times New Roman" w:eastAsia="Times New Roman"/>
           <w:b/>
           <w:i w:val="0"/>
           <w:color w:val="000000"/>
@@ -4598,7 +4657,7 @@
             </w:pPr>
             <w:r>
               <w:rPr>
-                <w:rFonts w:ascii="Times New Roman" w:hAnsi="Times New Roman"/>
+                <w:rFonts w:ascii="Times New Roman" w:hAnsi="Times New Roman" w:cs="Times New Roman" w:eastAsia="Times New Roman"/>
                 <w:b/>
                 <w:i w:val="0"/>
                 <w:color w:val="FFFFFF"/>
@@ -4621,7 +4680,7 @@
             </w:pPr>
             <w:r>
               <w:rPr>
-                <w:rFonts w:ascii="Times New Roman" w:hAnsi="Times New Roman"/>
+                <w:rFonts w:ascii="Times New Roman" w:hAnsi="Times New Roman" w:cs="Times New Roman" w:eastAsia="Times New Roman"/>
                 <w:b/>
                 <w:i w:val="0"/>
                 <w:color w:val="FFFFFF"/>
@@ -4644,7 +4703,7 @@
             </w:pPr>
             <w:r>
               <w:rPr>
-                <w:rFonts w:ascii="Times New Roman" w:hAnsi="Times New Roman"/>
+                <w:rFonts w:ascii="Times New Roman" w:hAnsi="Times New Roman" w:cs="Times New Roman" w:eastAsia="Times New Roman"/>
                 <w:b/>
                 <w:i w:val="0"/>
                 <w:color w:val="FFFFFF"/>
@@ -4667,7 +4726,7 @@
             </w:pPr>
             <w:r>
               <w:rPr>
-                <w:rFonts w:ascii="Times New Roman" w:hAnsi="Times New Roman"/>
+                <w:rFonts w:ascii="Times New Roman" w:hAnsi="Times New Roman" w:cs="Times New Roman" w:eastAsia="Times New Roman"/>
                 <w:b/>
                 <w:i w:val="0"/>
                 <w:color w:val="FFFFFF"/>
@@ -4690,7 +4749,7 @@
             </w:pPr>
             <w:r>
               <w:rPr>
-                <w:rFonts w:ascii="Times New Roman" w:hAnsi="Times New Roman"/>
+                <w:rFonts w:ascii="Times New Roman" w:hAnsi="Times New Roman" w:cs="Times New Roman" w:eastAsia="Times New Roman"/>
                 <w:b/>
                 <w:i w:val="0"/>
                 <w:color w:val="FFFFFF"/>
@@ -4715,7 +4774,7 @@
             </w:pPr>
             <w:r>
               <w:rPr>
-                <w:rFonts w:ascii="Times New Roman" w:hAnsi="Times New Roman"/>
+                <w:rFonts w:ascii="Times New Roman" w:hAnsi="Times New Roman" w:cs="Times New Roman" w:eastAsia="Times New Roman"/>
                 <w:b/>
                 <w:i w:val="0"/>
                 <w:color w:val="000000"/>
@@ -4738,7 +4797,7 @@
             </w:pPr>
             <w:r>
               <w:rPr>
-                <w:rFonts w:ascii="Times New Roman" w:hAnsi="Times New Roman"/>
+                <w:rFonts w:ascii="Times New Roman" w:hAnsi="Times New Roman" w:cs="Times New Roman" w:eastAsia="Times New Roman"/>
                 <w:b w:val="0"/>
                 <w:i w:val="0"/>
                 <w:color w:val="000000"/>
@@ -4761,7 +4820,7 @@
             </w:pPr>
             <w:r>
               <w:rPr>
-                <w:rFonts w:ascii="Times New Roman" w:hAnsi="Times New Roman"/>
+                <w:rFonts w:ascii="Times New Roman" w:hAnsi="Times New Roman" w:cs="Times New Roman" w:eastAsia="Times New Roman"/>
                 <w:b w:val="0"/>
                 <w:i w:val="0"/>
                 <w:color w:val="000000"/>
@@ -4784,7 +4843,7 @@
             </w:pPr>
             <w:r>
               <w:rPr>
-                <w:rFonts w:ascii="Times New Roman" w:hAnsi="Times New Roman"/>
+                <w:rFonts w:ascii="Times New Roman" w:hAnsi="Times New Roman" w:cs="Times New Roman" w:eastAsia="Times New Roman"/>
                 <w:b w:val="0"/>
                 <w:i w:val="0"/>
                 <w:color w:val="000000"/>
@@ -4807,7 +4866,7 @@
             </w:pPr>
             <w:r>
               <w:rPr>
-                <w:rFonts w:ascii="Times New Roman" w:hAnsi="Times New Roman"/>
+                <w:rFonts w:ascii="Times New Roman" w:hAnsi="Times New Roman" w:cs="Times New Roman" w:eastAsia="Times New Roman"/>
                 <w:b w:val="0"/>
                 <w:i w:val="0"/>
                 <w:color w:val="000000"/>
@@ -4832,7 +4891,7 @@
             </w:pPr>
             <w:r>
               <w:rPr>
-                <w:rFonts w:ascii="Times New Roman" w:hAnsi="Times New Roman"/>
+                <w:rFonts w:ascii="Times New Roman" w:hAnsi="Times New Roman" w:cs="Times New Roman" w:eastAsia="Times New Roman"/>
                 <w:b/>
                 <w:i w:val="0"/>
                 <w:color w:val="000000"/>
@@ -4855,7 +4914,7 @@
             </w:pPr>
             <w:r>
               <w:rPr>
-                <w:rFonts w:ascii="Times New Roman" w:hAnsi="Times New Roman"/>
+                <w:rFonts w:ascii="Times New Roman" w:hAnsi="Times New Roman" w:cs="Times New Roman" w:eastAsia="Times New Roman"/>
                 <w:b w:val="0"/>
                 <w:i w:val="0"/>
                 <w:color w:val="000000"/>
@@ -4878,7 +4937,7 @@
             </w:pPr>
             <w:r>
               <w:rPr>
-                <w:rFonts w:ascii="Times New Roman" w:hAnsi="Times New Roman"/>
+                <w:rFonts w:ascii="Times New Roman" w:hAnsi="Times New Roman" w:cs="Times New Roman" w:eastAsia="Times New Roman"/>
                 <w:b w:val="0"/>
                 <w:i w:val="0"/>
                 <w:color w:val="000000"/>
@@ -4901,7 +4960,7 @@
             </w:pPr>
             <w:r>
               <w:rPr>
-                <w:rFonts w:ascii="Times New Roman" w:hAnsi="Times New Roman"/>
+                <w:rFonts w:ascii="Times New Roman" w:hAnsi="Times New Roman" w:cs="Times New Roman" w:eastAsia="Times New Roman"/>
                 <w:b w:val="0"/>
                 <w:i w:val="0"/>
                 <w:color w:val="000000"/>
@@ -4924,7 +4983,7 @@
             </w:pPr>
             <w:r>
               <w:rPr>
-                <w:rFonts w:ascii="Times New Roman" w:hAnsi="Times New Roman"/>
+                <w:rFonts w:ascii="Times New Roman" w:hAnsi="Times New Roman" w:cs="Times New Roman" w:eastAsia="Times New Roman"/>
                 <w:b w:val="0"/>
                 <w:i w:val="0"/>
                 <w:color w:val="000000"/>
@@ -4949,7 +5008,7 @@
             </w:pPr>
             <w:r>
               <w:rPr>
-                <w:rFonts w:ascii="Times New Roman" w:hAnsi="Times New Roman"/>
+                <w:rFonts w:ascii="Times New Roman" w:hAnsi="Times New Roman" w:cs="Times New Roman" w:eastAsia="Times New Roman"/>
                 <w:b/>
                 <w:i w:val="0"/>
                 <w:color w:val="000000"/>
@@ -4972,7 +5031,7 @@
             </w:pPr>
             <w:r>
               <w:rPr>
-                <w:rFonts w:ascii="Times New Roman" w:hAnsi="Times New Roman"/>
+                <w:rFonts w:ascii="Times New Roman" w:hAnsi="Times New Roman" w:cs="Times New Roman" w:eastAsia="Times New Roman"/>
                 <w:b w:val="0"/>
                 <w:i w:val="0"/>
                 <w:color w:val="000000"/>
@@ -4995,7 +5054,7 @@
             </w:pPr>
             <w:r>
               <w:rPr>
-                <w:rFonts w:ascii="Times New Roman" w:hAnsi="Times New Roman"/>
+                <w:rFonts w:ascii="Times New Roman" w:hAnsi="Times New Roman" w:cs="Times New Roman" w:eastAsia="Times New Roman"/>
                 <w:b w:val="0"/>
                 <w:i w:val="0"/>
                 <w:color w:val="000000"/>
@@ -5018,7 +5077,7 @@
             </w:pPr>
             <w:r>
               <w:rPr>
-                <w:rFonts w:ascii="Times New Roman" w:hAnsi="Times New Roman"/>
+                <w:rFonts w:ascii="Times New Roman" w:hAnsi="Times New Roman" w:cs="Times New Roman" w:eastAsia="Times New Roman"/>
                 <w:b w:val="0"/>
                 <w:i w:val="0"/>
                 <w:color w:val="000000"/>
@@ -5041,7 +5100,7 @@
             </w:pPr>
             <w:r>
               <w:rPr>
-                <w:rFonts w:ascii="Times New Roman" w:hAnsi="Times New Roman"/>
+                <w:rFonts w:ascii="Times New Roman" w:hAnsi="Times New Roman" w:cs="Times New Roman" w:eastAsia="Times New Roman"/>
                 <w:b w:val="0"/>
                 <w:i w:val="0"/>
                 <w:color w:val="000000"/>
@@ -5066,7 +5125,7 @@
             </w:pPr>
             <w:r>
               <w:rPr>
-                <w:rFonts w:ascii="Times New Roman" w:hAnsi="Times New Roman"/>
+                <w:rFonts w:ascii="Times New Roman" w:hAnsi="Times New Roman" w:cs="Times New Roman" w:eastAsia="Times New Roman"/>
                 <w:b/>
                 <w:i w:val="0"/>
                 <w:color w:val="000000"/>
@@ -5089,7 +5148,7 @@
             </w:pPr>
             <w:r>
               <w:rPr>
-                <w:rFonts w:ascii="Times New Roman" w:hAnsi="Times New Roman"/>
+                <w:rFonts w:ascii="Times New Roman" w:hAnsi="Times New Roman" w:cs="Times New Roman" w:eastAsia="Times New Roman"/>
                 <w:b w:val="0"/>
                 <w:i w:val="0"/>
                 <w:color w:val="000000"/>
@@ -5112,7 +5171,7 @@
             </w:pPr>
             <w:r>
               <w:rPr>
-                <w:rFonts w:ascii="Times New Roman" w:hAnsi="Times New Roman"/>
+                <w:rFonts w:ascii="Times New Roman" w:hAnsi="Times New Roman" w:cs="Times New Roman" w:eastAsia="Times New Roman"/>
                 <w:b w:val="0"/>
                 <w:i w:val="0"/>
                 <w:color w:val="000000"/>
@@ -5135,7 +5194,7 @@
             </w:pPr>
             <w:r>
               <w:rPr>
-                <w:rFonts w:ascii="Times New Roman" w:hAnsi="Times New Roman"/>
+                <w:rFonts w:ascii="Times New Roman" w:hAnsi="Times New Roman" w:cs="Times New Roman" w:eastAsia="Times New Roman"/>
                 <w:b w:val="0"/>
                 <w:i w:val="0"/>
                 <w:color w:val="000000"/>
@@ -5158,7 +5217,7 @@
             </w:pPr>
             <w:r>
               <w:rPr>
-                <w:rFonts w:ascii="Times New Roman" w:hAnsi="Times New Roman"/>
+                <w:rFonts w:ascii="Times New Roman" w:hAnsi="Times New Roman" w:cs="Times New Roman" w:eastAsia="Times New Roman"/>
                 <w:b w:val="0"/>
                 <w:i w:val="0"/>
                 <w:color w:val="000000"/>
@@ -5183,7 +5242,7 @@
             </w:pPr>
             <w:r>
               <w:rPr>
-                <w:rFonts w:ascii="Times New Roman" w:hAnsi="Times New Roman"/>
+                <w:rFonts w:ascii="Times New Roman" w:hAnsi="Times New Roman" w:cs="Times New Roman" w:eastAsia="Times New Roman"/>
                 <w:b/>
                 <w:i w:val="0"/>
                 <w:color w:val="000000"/>
@@ -5206,7 +5265,7 @@
             </w:pPr>
             <w:r>
               <w:rPr>
-                <w:rFonts w:ascii="Times New Roman" w:hAnsi="Times New Roman"/>
+                <w:rFonts w:ascii="Times New Roman" w:hAnsi="Times New Roman" w:cs="Times New Roman" w:eastAsia="Times New Roman"/>
                 <w:b w:val="0"/>
                 <w:i w:val="0"/>
                 <w:color w:val="000000"/>
@@ -5229,7 +5288,7 @@
             </w:pPr>
             <w:r>
               <w:rPr>
-                <w:rFonts w:ascii="Times New Roman" w:hAnsi="Times New Roman"/>
+                <w:rFonts w:ascii="Times New Roman" w:hAnsi="Times New Roman" w:cs="Times New Roman" w:eastAsia="Times New Roman"/>
                 <w:b w:val="0"/>
                 <w:i w:val="0"/>
                 <w:color w:val="000000"/>
@@ -5252,7 +5311,7 @@
             </w:pPr>
             <w:r>
               <w:rPr>
-                <w:rFonts w:ascii="Times New Roman" w:hAnsi="Times New Roman"/>
+                <w:rFonts w:ascii="Times New Roman" w:hAnsi="Times New Roman" w:cs="Times New Roman" w:eastAsia="Times New Roman"/>
                 <w:b w:val="0"/>
                 <w:i w:val="0"/>
                 <w:color w:val="000000"/>
@@ -5275,7 +5334,7 @@
             </w:pPr>
             <w:r>
               <w:rPr>
-                <w:rFonts w:ascii="Times New Roman" w:hAnsi="Times New Roman"/>
+                <w:rFonts w:ascii="Times New Roman" w:hAnsi="Times New Roman" w:cs="Times New Roman" w:eastAsia="Times New Roman"/>
                 <w:b w:val="0"/>
                 <w:i w:val="0"/>
                 <w:color w:val="000000"/>
@@ -5294,7 +5353,7 @@
       </w:pPr>
       <w:r>
         <w:rPr>
-          <w:rFonts w:ascii="Times New Roman" w:hAnsi="Times New Roman"/>
+          <w:rFonts w:ascii="Times New Roman" w:hAnsi="Times New Roman" w:cs="Times New Roman" w:eastAsia="Times New Roman"/>
           <w:b w:val="0"/>
           <w:i w:val="0"/>
           <w:color w:val="000000"/>
@@ -5311,7 +5370,7 @@
       </w:pPr>
       <w:r>
         <w:rPr>
-          <w:rFonts w:ascii="Times New Roman" w:hAnsi="Times New Roman"/>
+          <w:rFonts w:ascii="Times New Roman" w:hAnsi="Times New Roman" w:cs="Times New Roman" w:eastAsia="Times New Roman"/>
           <w:b/>
           <w:i w:val="0"/>
           <w:color w:val="000000"/>
@@ -5327,7 +5386,7 @@
       </w:pPr>
       <w:r>
         <w:rPr>
-          <w:rFonts w:ascii="Times New Roman" w:hAnsi="Times New Roman"/>
+          <w:rFonts w:ascii="Times New Roman" w:hAnsi="Times New Roman" w:cs="Times New Roman" w:eastAsia="Times New Roman"/>
           <w:b w:val="0"/>
           <w:i w:val="0"/>
           <w:color w:val="000000"/>
@@ -5343,7 +5402,7 @@
       </w:pPr>
       <w:r>
         <w:rPr>
-          <w:rFonts w:ascii="Times New Roman" w:hAnsi="Times New Roman"/>
+          <w:rFonts w:ascii="Times New Roman" w:hAnsi="Times New Roman" w:cs="Times New Roman" w:eastAsia="Times New Roman"/>
           <w:b w:val="0"/>
           <w:i w:val="0"/>
           <w:color w:val="000000"/>
@@ -5360,7 +5419,7 @@
       </w:pPr>
       <w:r>
         <w:rPr>
-          <w:rFonts w:ascii="Times New Roman" w:hAnsi="Times New Roman"/>
+          <w:rFonts w:ascii="Times New Roman" w:hAnsi="Times New Roman" w:cs="Times New Roman" w:eastAsia="Times New Roman"/>
           <w:b/>
           <w:i w:val="0"/>
           <w:color w:val="000000"/>
@@ -5376,7 +5435,7 @@
       </w:pPr>
       <w:r>
         <w:rPr>
-          <w:rFonts w:ascii="Times New Roman" w:hAnsi="Times New Roman"/>
+          <w:rFonts w:ascii="Times New Roman" w:hAnsi="Times New Roman" w:cs="Times New Roman" w:eastAsia="Times New Roman"/>
           <w:b w:val="0"/>
           <w:i w:val="0"/>
           <w:color w:val="000000"/>
@@ -5392,7 +5451,7 @@
       </w:pPr>
       <w:r>
         <w:rPr>
-          <w:rFonts w:ascii="Times New Roman" w:hAnsi="Times New Roman"/>
+          <w:rFonts w:ascii="Times New Roman" w:hAnsi="Times New Roman" w:cs="Times New Roman" w:eastAsia="Times New Roman"/>
           <w:b w:val="0"/>
           <w:i w:val="0"/>
           <w:color w:val="000000"/>
@@ -5408,7 +5467,7 @@
       </w:pPr>
       <w:r>
         <w:rPr>
-          <w:rFonts w:ascii="Times New Roman" w:hAnsi="Times New Roman"/>
+          <w:rFonts w:ascii="Times New Roman" w:hAnsi="Times New Roman" w:cs="Times New Roman" w:eastAsia="Times New Roman"/>
           <w:b w:val="0"/>
           <w:i w:val="0"/>
           <w:color w:val="000000"/>
@@ -5424,7 +5483,7 @@
       </w:pPr>
       <w:r>
         <w:rPr>
-          <w:rFonts w:ascii="Times New Roman" w:hAnsi="Times New Roman"/>
+          <w:rFonts w:ascii="Times New Roman" w:hAnsi="Times New Roman" w:cs="Times New Roman" w:eastAsia="Times New Roman"/>
           <w:b w:val="0"/>
           <w:i w:val="0"/>
           <w:color w:val="000000"/>
@@ -5440,7 +5499,7 @@
       </w:pPr>
       <w:r>
         <w:rPr>
-          <w:rFonts w:ascii="Times New Roman" w:hAnsi="Times New Roman"/>
+          <w:rFonts w:ascii="Times New Roman" w:hAnsi="Times New Roman" w:cs="Times New Roman" w:eastAsia="Times New Roman"/>
           <w:b w:val="0"/>
           <w:i w:val="0"/>
           <w:color w:val="000000"/>
@@ -5456,7 +5515,7 @@
       </w:pPr>
       <w:r>
         <w:rPr>
-          <w:rFonts w:ascii="Times New Roman" w:hAnsi="Times New Roman"/>
+          <w:rFonts w:ascii="Times New Roman" w:hAnsi="Times New Roman" w:cs="Times New Roman" w:eastAsia="Times New Roman"/>
           <w:b w:val="0"/>
           <w:i w:val="0"/>
           <w:color w:val="000000"/>
@@ -5472,7 +5531,7 @@
       </w:pPr>
       <w:r>
         <w:rPr>
-          <w:rFonts w:ascii="Times New Roman" w:hAnsi="Times New Roman"/>
+          <w:rFonts w:ascii="Times New Roman" w:hAnsi="Times New Roman" w:cs="Times New Roman" w:eastAsia="Times New Roman"/>
           <w:b w:val="0"/>
           <w:i w:val="0"/>
           <w:color w:val="000000"/>
@@ -5488,7 +5547,7 @@
       </w:pPr>
       <w:r>
         <w:rPr>
-          <w:rFonts w:ascii="Times New Roman" w:hAnsi="Times New Roman"/>
+          <w:rFonts w:ascii="Times New Roman" w:hAnsi="Times New Roman" w:cs="Times New Roman" w:eastAsia="Times New Roman"/>
           <w:b w:val="0"/>
           <w:i w:val="0"/>
           <w:color w:val="000000"/>
@@ -5504,7 +5563,7 @@
       </w:pPr>
       <w:r>
         <w:rPr>
-          <w:rFonts w:ascii="Times New Roman" w:hAnsi="Times New Roman"/>
+          <w:rFonts w:ascii="Times New Roman" w:hAnsi="Times New Roman" w:cs="Times New Roman" w:eastAsia="Times New Roman"/>
           <w:b w:val="0"/>
           <w:i w:val="0"/>
           <w:color w:val="000000"/>
@@ -5520,7 +5579,7 @@
       </w:pPr>
       <w:r>
         <w:rPr>
-          <w:rFonts w:ascii="Times New Roman" w:hAnsi="Times New Roman"/>
+          <w:rFonts w:ascii="Times New Roman" w:hAnsi="Times New Roman" w:cs="Times New Roman" w:eastAsia="Times New Roman"/>
           <w:b w:val="0"/>
           <w:i w:val="0"/>
           <w:color w:val="000000"/>
@@ -5536,7 +5595,7 @@
       </w:pPr>
       <w:r>
         <w:rPr>
-          <w:rFonts w:ascii="Times New Roman" w:hAnsi="Times New Roman"/>
+          <w:rFonts w:ascii="Times New Roman" w:hAnsi="Times New Roman" w:cs="Times New Roman" w:eastAsia="Times New Roman"/>
           <w:b w:val="0"/>
           <w:i w:val="0"/>
           <w:color w:val="000000"/>
@@ -5552,7 +5611,7 @@
       </w:pPr>
       <w:r>
         <w:rPr>
-          <w:rFonts w:ascii="Times New Roman" w:hAnsi="Times New Roman"/>
+          <w:rFonts w:ascii="Times New Roman" w:hAnsi="Times New Roman" w:cs="Times New Roman" w:eastAsia="Times New Roman"/>
           <w:b w:val="0"/>
           <w:i w:val="0"/>
           <w:color w:val="000000"/>
@@ -5593,7 +5652,7 @@
     </w:pPr>
     <w:r>
       <w:rPr>
-        <w:rFonts w:ascii="Times New Roman" w:hAnsi="Times New Roman"/>
+        <w:rFonts w:ascii="Times New Roman" w:hAnsi="Times New Roman" w:cs="Times New Roman" w:eastAsia="Times New Roman"/>
         <w:b w:val="0"/>
         <w:i w:val="0"/>
         <w:color w:val="000000"/>
@@ -5816,7 +5875,7 @@
   <w:docDefaults>
     <w:rPrDefault>
       <w:rPr>
-        <w:rFonts w:asciiTheme="minorHAnsi" w:eastAsiaTheme="minorEastAsia" w:hAnsiTheme="minorHAnsi" w:cstheme="minorBidi"/>
+        <w:rFonts w:ascii="Times New Roman" w:hAnsi="Times New Roman" w:cs="Times New Roman" w:eastAsia="Times New Roman"/>
         <w:sz w:val="22"/>
         <w:szCs w:val="22"/>
         <w:lang w:val="en-US" w:eastAsia="en-US" w:bidi="ar-SA"/>
@@ -5971,6 +6030,9 @@
     <w:name w:val="Normal"/>
     <w:qFormat/>
     <w:rsid w:val="00FC693F"/>
+    <w:rPr>
+      <w:rFonts w:ascii="Times New Roman" w:hAnsi="Times New Roman" w:cs="Times New Roman" w:eastAsia="Times New Roman"/>
+    </w:rPr>
   </w:style>
   <w:style w:type="paragraph" w:styleId="Header">
     <w:name w:val="header"/>

</xml_diff>